<commit_message>
Testbench & Assertions Vivado Added
</commit_message>
<xml_diff>
--- a/Team9_Lab1_Module4.docx
+++ b/Team9_Lab1_Module4.docx
@@ -162,7 +162,7 @@
           <w:noProof/>
         </w:rPr>
         <w:drawing>
-          <wp:anchor distT="0" distB="0" distL="114300" distR="114300" simplePos="0" relativeHeight="251771904" behindDoc="0" locked="0" layoutInCell="1" allowOverlap="1" wp14:anchorId="51F05FE2" wp14:editId="55F85E3A">
+          <wp:anchor distT="0" distB="0" distL="114300" distR="114300" simplePos="0" relativeHeight="251768832" behindDoc="0" locked="0" layoutInCell="1" allowOverlap="1" wp14:anchorId="51F05FE2" wp14:editId="7B3C3FA7">
             <wp:simplePos x="0" y="0"/>
             <wp:positionH relativeFrom="margin">
               <wp:align>center</wp:align>
@@ -902,7 +902,7 @@
           <w:noProof/>
         </w:rPr>
         <w:drawing>
-          <wp:anchor distT="0" distB="0" distL="114300" distR="114300" simplePos="0" relativeHeight="251772928" behindDoc="0" locked="0" layoutInCell="1" allowOverlap="1" wp14:anchorId="3B585A3D" wp14:editId="1971BDCA">
+          <wp:anchor distT="0" distB="0" distL="114300" distR="114300" simplePos="0" relativeHeight="251769856" behindDoc="0" locked="0" layoutInCell="1" allowOverlap="1" wp14:anchorId="3B585A3D" wp14:editId="5162F482">
             <wp:simplePos x="0" y="0"/>
             <wp:positionH relativeFrom="margin">
               <wp:align>center</wp:align>
@@ -1242,18 +1242,18 @@
           <w:noProof/>
         </w:rPr>
         <w:drawing>
-          <wp:anchor distT="0" distB="0" distL="114300" distR="114300" simplePos="0" relativeHeight="251791360" behindDoc="0" locked="0" layoutInCell="1" allowOverlap="1" wp14:anchorId="0DA533F7" wp14:editId="7A0611FD">
+          <wp:anchor distT="0" distB="0" distL="114300" distR="114300" simplePos="0" relativeHeight="251788288" behindDoc="0" locked="0" layoutInCell="1" allowOverlap="1" wp14:anchorId="7FD8120A" wp14:editId="49F30FA6">
             <wp:simplePos x="0" y="0"/>
             <wp:positionH relativeFrom="margin">
-              <wp:align>left</wp:align>
+              <wp:align>right</wp:align>
             </wp:positionH>
             <wp:positionV relativeFrom="paragraph">
-              <wp:posOffset>149225</wp:posOffset>
+              <wp:posOffset>149805</wp:posOffset>
             </wp:positionV>
-            <wp:extent cx="5943600" cy="4244340"/>
-            <wp:effectExtent l="19050" t="19050" r="19050" b="22860"/>
+            <wp:extent cx="5943600" cy="4251960"/>
+            <wp:effectExtent l="19050" t="19050" r="19050" b="15240"/>
             <wp:wrapNone/>
-            <wp:docPr id="438838921" name="Imagen 1"/>
+            <wp:docPr id="1601162512" name="Imagen 1"/>
             <wp:cNvGraphicFramePr>
               <a:graphicFrameLocks xmlns:a="http://schemas.openxmlformats.org/drawingml/2006/main" noChangeAspect="1"/>
             </wp:cNvGraphicFramePr>
@@ -1261,7 +1261,7 @@
               <a:graphicData uri="http://schemas.openxmlformats.org/drawingml/2006/picture">
                 <pic:pic xmlns:pic="http://schemas.openxmlformats.org/drawingml/2006/picture">
                   <pic:nvPicPr>
-                    <pic:cNvPr id="438838921" name=""/>
+                    <pic:cNvPr id="1601162512" name=""/>
                     <pic:cNvPicPr/>
                   </pic:nvPicPr>
                   <pic:blipFill>
@@ -1279,7 +1279,7 @@
                   <pic:spPr>
                     <a:xfrm>
                       <a:off x="0" y="0"/>
-                      <a:ext cx="5943600" cy="4244340"/>
+                      <a:ext cx="5943600" cy="4251960"/>
                     </a:xfrm>
                     <a:prstGeom prst="rect">
                       <a:avLst/>
@@ -1611,7 +1611,7 @@
           <w:noProof/>
         </w:rPr>
         <w:drawing>
-          <wp:anchor distT="0" distB="0" distL="114300" distR="114300" simplePos="0" relativeHeight="251778048" behindDoc="0" locked="0" layoutInCell="1" allowOverlap="1" wp14:anchorId="6460DE6A" wp14:editId="01EDDC39">
+          <wp:anchor distT="0" distB="0" distL="114300" distR="114300" simplePos="0" relativeHeight="251774976" behindDoc="0" locked="0" layoutInCell="1" allowOverlap="1" wp14:anchorId="6460DE6A" wp14:editId="5C4B0F65">
             <wp:simplePos x="0" y="0"/>
             <wp:positionH relativeFrom="margin">
               <wp:align>center</wp:align>
@@ -1813,7 +1813,7 @@
           <w:noProof/>
         </w:rPr>
         <w:drawing>
-          <wp:anchor distT="0" distB="0" distL="114300" distR="114300" simplePos="0" relativeHeight="251779072" behindDoc="0" locked="0" layoutInCell="1" allowOverlap="1" wp14:anchorId="4A655CFF" wp14:editId="0A49F7D8">
+          <wp:anchor distT="0" distB="0" distL="114300" distR="114300" simplePos="0" relativeHeight="251776000" behindDoc="0" locked="0" layoutInCell="1" allowOverlap="1" wp14:anchorId="4A655CFF" wp14:editId="469A6C4F">
             <wp:simplePos x="0" y="0"/>
             <wp:positionH relativeFrom="margin">
               <wp:align>left</wp:align>
@@ -2005,7 +2005,7 @@
           <w:noProof/>
         </w:rPr>
         <w:drawing>
-          <wp:anchor distT="0" distB="0" distL="114300" distR="114300" simplePos="0" relativeHeight="251784192" behindDoc="0" locked="0" layoutInCell="1" allowOverlap="1" wp14:anchorId="3A109C55" wp14:editId="0FA64136">
+          <wp:anchor distT="0" distB="0" distL="114300" distR="114300" simplePos="0" relativeHeight="251781120" behindDoc="0" locked="0" layoutInCell="1" allowOverlap="1" wp14:anchorId="3A109C55" wp14:editId="1D9A308A">
             <wp:simplePos x="0" y="0"/>
             <wp:positionH relativeFrom="column">
               <wp:posOffset>3360420</wp:posOffset>
@@ -2065,7 +2065,7 @@
           <w:noProof/>
         </w:rPr>
         <w:drawing>
-          <wp:anchor distT="0" distB="0" distL="114300" distR="114300" simplePos="0" relativeHeight="251780096" behindDoc="0" locked="0" layoutInCell="1" allowOverlap="1" wp14:anchorId="20951B11" wp14:editId="66C4E3C4">
+          <wp:anchor distT="0" distB="0" distL="114300" distR="114300" simplePos="0" relativeHeight="251777024" behindDoc="0" locked="0" layoutInCell="1" allowOverlap="1" wp14:anchorId="20951B11" wp14:editId="2D39EBA4">
             <wp:simplePos x="0" y="0"/>
             <wp:positionH relativeFrom="margin">
               <wp:posOffset>7620</wp:posOffset>
@@ -2146,7 +2146,7 @@
         <mc:AlternateContent>
           <mc:Choice Requires="wps">
             <w:drawing>
-              <wp:anchor distT="0" distB="0" distL="114300" distR="114300" simplePos="0" relativeHeight="251783168" behindDoc="0" locked="0" layoutInCell="1" allowOverlap="1" wp14:anchorId="584BEA5F" wp14:editId="5476F2EB">
+              <wp:anchor distT="0" distB="0" distL="114300" distR="114300" simplePos="0" relativeHeight="251780096" behindDoc="0" locked="0" layoutInCell="1" allowOverlap="1" wp14:anchorId="584BEA5F" wp14:editId="2211BD5C">
                 <wp:simplePos x="0" y="0"/>
                 <wp:positionH relativeFrom="margin">
                   <wp:align>center</wp:align>
@@ -2202,7 +2202,7 @@
           </mc:Choice>
           <mc:Fallback>
             <w:pict>
-              <v:shapetype w14:anchorId="05F95DA3" id="_x0000_t13" coordsize="21600,21600" o:spt="13" adj="16200,5400" path="m@0,l@0@1,0@1,0@2@0@2@0,21600,21600,10800xe">
+              <v:shapetype w14:anchorId="48887C2A" id="_x0000_t13" coordsize="21600,21600" o:spt="13" adj="16200,5400" path="m@0,l@0@1,0@1,0@2@0@2@0,21600,21600,10800xe">
                 <v:stroke joinstyle="miter"/>
                 <v:formulas>
                   <v:f eqn="val #0"/>
@@ -2218,7 +2218,7 @@
                   <v:h position="#0,#1" xrange="0,21600" yrange="0,10800"/>
                 </v:handles>
               </v:shapetype>
-              <v:shape id="Flecha: a la derecha 2" o:spid="_x0000_s1026" type="#_x0000_t13" style="position:absolute;margin-left:0;margin-top:2.1pt;width:25.2pt;height:24.6pt;z-index:251783168;visibility:visible;mso-wrap-style:square;mso-wrap-distance-left:9pt;mso-wrap-distance-top:0;mso-wrap-distance-right:9pt;mso-wrap-distance-bottom:0;mso-position-horizontal:center;mso-position-horizontal-relative:margin;mso-position-vertical:absolute;mso-position-vertical-relative:text;v-text-anchor:middle" o:gfxdata="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" adj="11057" fillcolor="#4472c4 [3204]" strokecolor="#09101d [484]" strokeweight="1pt">
+              <v:shape id="Flecha: a la derecha 2" o:spid="_x0000_s1026" type="#_x0000_t13" style="position:absolute;margin-left:0;margin-top:2.1pt;width:25.2pt;height:24.6pt;z-index:251780096;visibility:visible;mso-wrap-style:square;mso-wrap-distance-left:9pt;mso-wrap-distance-top:0;mso-wrap-distance-right:9pt;mso-wrap-distance-bottom:0;mso-position-horizontal:center;mso-position-horizontal-relative:margin;mso-position-vertical:absolute;mso-position-vertical-relative:text;v-text-anchor:middle" o:gfxdata="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" adj="11057" fillcolor="#4472c4 [3204]" strokecolor="#09101d [484]" strokeweight="1pt">
                 <w10:wrap anchorx="margin"/>
               </v:shape>
             </w:pict>
@@ -2245,7 +2245,7 @@
           <w:noProof/>
         </w:rPr>
         <w:drawing>
-          <wp:anchor distT="0" distB="0" distL="114300" distR="114300" simplePos="0" relativeHeight="251787264" behindDoc="0" locked="0" layoutInCell="1" allowOverlap="1" wp14:anchorId="01470767" wp14:editId="4C96F6CF">
+          <wp:anchor distT="0" distB="0" distL="114300" distR="114300" simplePos="0" relativeHeight="251784192" behindDoc="0" locked="0" layoutInCell="1" allowOverlap="1" wp14:anchorId="01470767" wp14:editId="517FD8EF">
             <wp:simplePos x="0" y="0"/>
             <wp:positionH relativeFrom="column">
               <wp:posOffset>3383280</wp:posOffset>
@@ -2367,7 +2367,7 @@
           <w:noProof/>
         </w:rPr>
         <w:drawing>
-          <wp:anchor distT="0" distB="0" distL="114300" distR="114300" simplePos="0" relativeHeight="251785216" behindDoc="0" locked="0" layoutInCell="1" allowOverlap="1" wp14:anchorId="104B31EB" wp14:editId="3E2395C8">
+          <wp:anchor distT="0" distB="0" distL="114300" distR="114300" simplePos="0" relativeHeight="251782144" behindDoc="0" locked="0" layoutInCell="1" allowOverlap="1" wp14:anchorId="104B31EB" wp14:editId="3F44E7DD">
             <wp:simplePos x="0" y="0"/>
             <wp:positionH relativeFrom="margin">
               <wp:align>left</wp:align>
@@ -2443,7 +2443,7 @@
         <mc:AlternateContent>
           <mc:Choice Requires="wps">
             <w:drawing>
-              <wp:anchor distT="0" distB="0" distL="114300" distR="114300" simplePos="0" relativeHeight="251789312" behindDoc="0" locked="0" layoutInCell="1" allowOverlap="1" wp14:anchorId="5CAB2FBE" wp14:editId="151B2FBE">
+              <wp:anchor distT="0" distB="0" distL="114300" distR="114300" simplePos="0" relativeHeight="251786240" behindDoc="0" locked="0" layoutInCell="1" allowOverlap="1" wp14:anchorId="5CAB2FBE" wp14:editId="30B225E3">
                 <wp:simplePos x="0" y="0"/>
                 <wp:positionH relativeFrom="margin">
                   <wp:posOffset>2973705</wp:posOffset>
@@ -2499,7 +2499,7 @@
           </mc:Choice>
           <mc:Fallback>
             <w:pict>
-              <v:shape w14:anchorId="625C303E" id="Flecha: a la derecha 2" o:spid="_x0000_s1026" type="#_x0000_t13" style="position:absolute;margin-left:234.15pt;margin-top:11.45pt;width:25.2pt;height:24.6pt;z-index:251789312;visibility:visible;mso-wrap-style:square;mso-wrap-distance-left:9pt;mso-wrap-distance-top:0;mso-wrap-distance-right:9pt;mso-wrap-distance-bottom:0;mso-position-horizontal:absolute;mso-position-horizontal-relative:margin;mso-position-vertical:absolute;mso-position-vertical-relative:text;v-text-anchor:middle" o:gfxdata="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" adj="11057" fillcolor="#4472c4 [3204]" strokecolor="#09101d [484]" strokeweight="1pt">
+              <v:shape w14:anchorId="22F943B1" id="Flecha: a la derecha 2" o:spid="_x0000_s1026" type="#_x0000_t13" style="position:absolute;margin-left:234.15pt;margin-top:11.45pt;width:25.2pt;height:24.6pt;z-index:251786240;visibility:visible;mso-wrap-style:square;mso-wrap-distance-left:9pt;mso-wrap-distance-top:0;mso-wrap-distance-right:9pt;mso-wrap-distance-bottom:0;mso-position-horizontal:absolute;mso-position-horizontal-relative:margin;mso-position-vertical:absolute;mso-position-vertical-relative:text;v-text-anchor:middle" o:gfxdata="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" adj="11057" fillcolor="#4472c4 [3204]" strokecolor="#09101d [484]" strokeweight="1pt">
                 <w10:wrap anchorx="margin"/>
               </v:shape>
             </w:pict>
@@ -2527,7 +2527,7 @@
           <w:noProof/>
         </w:rPr>
         <w:drawing>
-          <wp:anchor distT="0" distB="0" distL="114300" distR="114300" simplePos="0" relativeHeight="251790336" behindDoc="0" locked="0" layoutInCell="1" allowOverlap="1" wp14:anchorId="3661B789" wp14:editId="64545150">
+          <wp:anchor distT="0" distB="0" distL="114300" distR="114300" simplePos="0" relativeHeight="251787264" behindDoc="0" locked="0" layoutInCell="1" allowOverlap="1" wp14:anchorId="3661B789" wp14:editId="3D643FDE">
             <wp:simplePos x="0" y="0"/>
             <wp:positionH relativeFrom="margin">
               <wp:align>center</wp:align>
@@ -2702,8 +2702,6 @@
           <w:b/>
           <w:bCs/>
           <w:color w:val="002060"/>
-          <w:sz w:val="24"/>
-          <w:szCs w:val="24"/>
         </w:rPr>
       </w:pPr>
       <w:r>
@@ -2764,6 +2762,7 @@
         <w:t xml:space="preserve"> traffic_light.sv</w:t>
       </w:r>
     </w:p>
+    <w:p/>
     <w:p>
       <w:pPr>
         <w:pStyle w:val="Ttulo1"/>
@@ -2779,25 +2778,35 @@
           <w:b/>
           <w:bCs/>
         </w:rPr>
-        <w:t>TestBench</w:t>
-      </w:r>
+        <w:t xml:space="preserve">FPGA </w:t>
+      </w:r>
+    </w:p>
+    <w:p>
+      <w:pPr>
+        <w:spacing w:line="360" w:lineRule="auto"/>
+        <w:jc w:val="both"/>
+        <w:rPr>
+          <w:sz w:val="24"/>
+          <w:szCs w:val="24"/>
+        </w:rPr>
+      </w:pPr>
       <w:r>
         <w:rPr>
           <w:noProof/>
         </w:rPr>
         <w:drawing>
-          <wp:anchor distT="0" distB="0" distL="114300" distR="114300" simplePos="0" relativeHeight="251762688" behindDoc="0" locked="0" layoutInCell="1" allowOverlap="1" wp14:anchorId="3C15ACC0" wp14:editId="4612E1A4">
+          <wp:anchor distT="0" distB="0" distL="114300" distR="114300" simplePos="0" relativeHeight="251789312" behindDoc="0" locked="0" layoutInCell="1" allowOverlap="1" wp14:anchorId="594E0638" wp14:editId="0CAC31A5">
             <wp:simplePos x="0" y="0"/>
-            <wp:positionH relativeFrom="page">
-              <wp:posOffset>4347210</wp:posOffset>
+            <wp:positionH relativeFrom="margin">
+              <wp:align>center</wp:align>
             </wp:positionH>
             <wp:positionV relativeFrom="paragraph">
-              <wp:posOffset>374015</wp:posOffset>
+              <wp:posOffset>381635</wp:posOffset>
             </wp:positionV>
-            <wp:extent cx="2966085" cy="2558415"/>
-            <wp:effectExtent l="19050" t="19050" r="24765" b="13335"/>
+            <wp:extent cx="2887980" cy="1840865"/>
+            <wp:effectExtent l="19050" t="19050" r="26670" b="26035"/>
             <wp:wrapNone/>
-            <wp:docPr id="463780150" name="Imagen 1"/>
+            <wp:docPr id="1339783268" name="Imagen 1"/>
             <wp:cNvGraphicFramePr>
               <a:graphicFrameLocks xmlns:a="http://schemas.openxmlformats.org/drawingml/2006/main" noChangeAspect="1"/>
             </wp:cNvGraphicFramePr>
@@ -2805,7 +2814,7 @@
               <a:graphicData uri="http://schemas.openxmlformats.org/drawingml/2006/picture">
                 <pic:pic xmlns:pic="http://schemas.openxmlformats.org/drawingml/2006/picture">
                   <pic:nvPicPr>
-                    <pic:cNvPr id="463780150" name=""/>
+                    <pic:cNvPr id="1339783268" name=""/>
                     <pic:cNvPicPr/>
                   </pic:nvPicPr>
                   <pic:blipFill>
@@ -2823,7 +2832,7 @@
                   <pic:spPr>
                     <a:xfrm>
                       <a:off x="0" y="0"/>
-                      <a:ext cx="2966085" cy="2558415"/>
+                      <a:ext cx="2887980" cy="1840865"/>
                     </a:xfrm>
                     <a:prstGeom prst="rect">
                       <a:avLst/>
@@ -2846,14 +2855,99 @@
           </wp:anchor>
         </w:drawing>
       </w:r>
-    </w:p>
+      <w:r>
+        <w:rPr>
+          <w:sz w:val="24"/>
+          <w:szCs w:val="24"/>
+        </w:rPr>
+        <w:t>The corresponding pin assignment on the diagram was as follows.</w:t>
+      </w:r>
+    </w:p>
+    <w:p/>
+    <w:p/>
+    <w:p/>
+    <w:p/>
+    <w:p/>
+    <w:p/>
+    <w:p/>
+    <w:p>
+      <w:pPr>
+        <w:pStyle w:val="Descripcin"/>
+        <w:jc w:val="center"/>
+        <w:rPr>
+          <w:b/>
+          <w:bCs/>
+          <w:color w:val="002060"/>
+        </w:rPr>
+      </w:pPr>
+      <w:r>
+        <w:rPr>
+          <w:b/>
+          <w:bCs/>
+          <w:color w:val="002060"/>
+        </w:rPr>
+        <w:t xml:space="preserve">Figure: </w:t>
+      </w:r>
+      <w:r>
+        <w:rPr>
+          <w:b/>
+          <w:bCs/>
+          <w:color w:val="002060"/>
+        </w:rPr>
+        <w:fldChar w:fldCharType="begin"/>
+      </w:r>
+      <w:r>
+        <w:rPr>
+          <w:b/>
+          <w:bCs/>
+          <w:color w:val="002060"/>
+        </w:rPr>
+        <w:instrText xml:space="preserve"> SEQ Figure: \* ARABIC </w:instrText>
+      </w:r>
+      <w:r>
+        <w:rPr>
+          <w:b/>
+          <w:bCs/>
+          <w:color w:val="002060"/>
+        </w:rPr>
+        <w:fldChar w:fldCharType="separate"/>
+      </w:r>
+      <w:r>
+        <w:rPr>
+          <w:b/>
+          <w:bCs/>
+          <w:noProof/>
+          <w:color w:val="002060"/>
+        </w:rPr>
+        <w:t>5</w:t>
+      </w:r>
+      <w:r>
+        <w:rPr>
+          <w:b/>
+          <w:bCs/>
+          <w:color w:val="002060"/>
+        </w:rPr>
+        <w:fldChar w:fldCharType="end"/>
+      </w:r>
+      <w:r>
+        <w:rPr>
+          <w:b/>
+          <w:bCs/>
+          <w:color w:val="002060"/>
+        </w:rPr>
+        <w:t xml:space="preserve"> PinPlanner</w:t>
+      </w:r>
+    </w:p>
+    <w:p/>
+    <w:p/>
+    <w:p/>
     <w:p>
       <w:pPr>
         <w:spacing w:line="360" w:lineRule="auto"/>
         <w:jc w:val="both"/>
         <w:rPr>
-          <w:sz w:val="24"/>
-          <w:szCs w:val="24"/>
+          <w:b/>
+          <w:bCs/>
         </w:rPr>
       </w:pPr>
       <w:r>
@@ -2861,18 +2955,18 @@
           <w:noProof/>
         </w:rPr>
         <w:drawing>
-          <wp:anchor distT="0" distB="0" distL="114300" distR="114300" simplePos="0" relativeHeight="251763712" behindDoc="1" locked="0" layoutInCell="1" allowOverlap="1" wp14:anchorId="5148EA8F" wp14:editId="0EA2C741">
+          <wp:anchor distT="0" distB="0" distL="114300" distR="114300" simplePos="0" relativeHeight="251790336" behindDoc="0" locked="0" layoutInCell="1" allowOverlap="1" wp14:anchorId="7511B303" wp14:editId="44F92E5B">
             <wp:simplePos x="0" y="0"/>
             <wp:positionH relativeFrom="margin">
-              <wp:posOffset>-22860</wp:posOffset>
+              <wp:align>center</wp:align>
             </wp:positionH>
             <wp:positionV relativeFrom="paragraph">
-              <wp:posOffset>24130</wp:posOffset>
+              <wp:posOffset>377190</wp:posOffset>
             </wp:positionV>
-            <wp:extent cx="5781675" cy="2886075"/>
-            <wp:effectExtent l="19050" t="19050" r="28575" b="28575"/>
+            <wp:extent cx="6103645" cy="1767840"/>
+            <wp:effectExtent l="19050" t="19050" r="11430" b="22860"/>
             <wp:wrapNone/>
-            <wp:docPr id="80605123" name="Imagen 1"/>
+            <wp:docPr id="534904034" name="Imagen 1"/>
             <wp:cNvGraphicFramePr>
               <a:graphicFrameLocks xmlns:a="http://schemas.openxmlformats.org/drawingml/2006/main" noChangeAspect="1"/>
             </wp:cNvGraphicFramePr>
@@ -2880,11 +2974,11 @@
               <a:graphicData uri="http://schemas.openxmlformats.org/drawingml/2006/picture">
                 <pic:pic xmlns:pic="http://schemas.openxmlformats.org/drawingml/2006/picture">
                   <pic:nvPicPr>
-                    <pic:cNvPr id="80605123" name=""/>
+                    <pic:cNvPr id="534904034" name=""/>
                     <pic:cNvPicPr/>
                   </pic:nvPicPr>
                   <pic:blipFill>
-                    <a:blip r:embed="rId22">
+                    <a:blip r:embed="rId22" cstate="print">
                       <a:extLst>
                         <a:ext uri="{28A0092B-C50C-407E-A947-70E740481C1C}">
                           <a14:useLocalDpi xmlns:a14="http://schemas.microsoft.com/office/drawing/2010/main" val="0"/>
@@ -2898,7 +2992,7 @@
                   <pic:spPr>
                     <a:xfrm>
                       <a:off x="0" y="0"/>
-                      <a:ext cx="5781675" cy="2886075"/>
+                      <a:ext cx="6103645" cy="1767840"/>
                     </a:xfrm>
                     <a:prstGeom prst="rect">
                       <a:avLst/>
@@ -2921,14 +3015,31 @@
           </wp:anchor>
         </w:drawing>
       </w:r>
+      <w:r>
+        <w:t xml:space="preserve">The representation of </w:t>
+      </w:r>
+      <w:r>
+        <w:rPr>
+          <w:b/>
+          <w:bCs/>
+        </w:rPr>
+        <w:t>RTL Viewer</w:t>
+      </w:r>
+      <w:r>
+        <w:rPr>
+          <w:b/>
+          <w:bCs/>
+        </w:rPr>
+        <w:t>.</w:t>
+      </w:r>
     </w:p>
     <w:p>
       <w:pPr>
         <w:spacing w:line="360" w:lineRule="auto"/>
         <w:jc w:val="both"/>
         <w:rPr>
-          <w:sz w:val="24"/>
-          <w:szCs w:val="24"/>
+          <w:b/>
+          <w:bCs/>
         </w:rPr>
       </w:pPr>
     </w:p>
@@ -2936,50 +3047,6 @@
       <w:pPr>
         <w:spacing w:line="360" w:lineRule="auto"/>
         <w:jc w:val="both"/>
-        <w:rPr>
-          <w:sz w:val="24"/>
-          <w:szCs w:val="24"/>
-        </w:rPr>
-      </w:pPr>
-    </w:p>
-    <w:p>
-      <w:pPr>
-        <w:tabs>
-          <w:tab w:val="left" w:pos="4080"/>
-        </w:tabs>
-        <w:spacing w:line="360" w:lineRule="auto"/>
-        <w:jc w:val="both"/>
-        <w:rPr>
-          <w:sz w:val="24"/>
-          <w:szCs w:val="24"/>
-        </w:rPr>
-      </w:pPr>
-      <w:r>
-        <w:rPr>
-          <w:sz w:val="24"/>
-          <w:szCs w:val="24"/>
-        </w:rPr>
-        <w:tab/>
-      </w:r>
-    </w:p>
-    <w:p>
-      <w:pPr>
-        <w:pStyle w:val="Descripcin"/>
-        <w:rPr>
-          <w:b/>
-          <w:bCs/>
-          <w:color w:val="auto"/>
-        </w:rPr>
-      </w:pPr>
-    </w:p>
-    <w:p>
-      <w:pPr>
-        <w:pStyle w:val="Descripcin"/>
-        <w:rPr>
-          <w:b/>
-          <w:bCs/>
-          <w:color w:val="auto"/>
-        </w:rPr>
       </w:pPr>
     </w:p>
     <w:p/>
@@ -2993,14 +3060,14 @@
         <w:rPr>
           <w:b/>
           <w:bCs/>
-          <w:color w:val="2F5496" w:themeColor="accent1" w:themeShade="BF"/>
-        </w:rPr>
-      </w:pPr>
-      <w:r>
-        <w:rPr>
-          <w:b/>
-          <w:bCs/>
-          <w:color w:val="2F5496" w:themeColor="accent1" w:themeShade="BF"/>
+          <w:color w:val="002060"/>
+        </w:rPr>
+      </w:pPr>
+      <w:r>
+        <w:rPr>
+          <w:b/>
+          <w:bCs/>
+          <w:color w:val="002060"/>
         </w:rPr>
         <w:t xml:space="preserve">Figure: </w:t>
       </w:r>
@@ -3008,7 +3075,7 @@
         <w:rPr>
           <w:b/>
           <w:bCs/>
-          <w:color w:val="2F5496" w:themeColor="accent1" w:themeShade="BF"/>
+          <w:color w:val="002060"/>
         </w:rPr>
         <w:fldChar w:fldCharType="begin"/>
       </w:r>
@@ -3016,7 +3083,7 @@
         <w:rPr>
           <w:b/>
           <w:bCs/>
-          <w:color w:val="2F5496" w:themeColor="accent1" w:themeShade="BF"/>
+          <w:color w:val="002060"/>
         </w:rPr>
         <w:instrText xml:space="preserve"> SEQ Figure: \* ARABIC </w:instrText>
       </w:r>
@@ -3024,7 +3091,7 @@
         <w:rPr>
           <w:b/>
           <w:bCs/>
-          <w:color w:val="2F5496" w:themeColor="accent1" w:themeShade="BF"/>
+          <w:color w:val="002060"/>
         </w:rPr>
         <w:fldChar w:fldCharType="separate"/>
       </w:r>
@@ -3033,15 +3100,15 @@
           <w:b/>
           <w:bCs/>
           <w:noProof/>
-          <w:color w:val="2F5496" w:themeColor="accent1" w:themeShade="BF"/>
-        </w:rPr>
-        <w:t>7</w:t>
-      </w:r>
-      <w:r>
-        <w:rPr>
-          <w:b/>
-          <w:bCs/>
-          <w:color w:val="2F5496" w:themeColor="accent1" w:themeShade="BF"/>
+          <w:color w:val="002060"/>
+        </w:rPr>
+        <w:t>6</w:t>
+      </w:r>
+      <w:r>
+        <w:rPr>
+          <w:b/>
+          <w:bCs/>
+          <w:color w:val="002060"/>
         </w:rPr>
         <w:fldChar w:fldCharType="end"/>
       </w:r>
@@ -3049,34 +3116,161 @@
         <w:rPr>
           <w:b/>
           <w:bCs/>
-          <w:color w:val="2F5496" w:themeColor="accent1" w:themeShade="BF"/>
-        </w:rPr>
-        <w:t xml:space="preserve"> Testbech_Display</w:t>
+          <w:color w:val="002060"/>
+        </w:rPr>
+        <w:t xml:space="preserve"> RTL Viewer</w:t>
       </w:r>
     </w:p>
     <w:p>
       <w:pPr>
         <w:pStyle w:val="Ttulo1"/>
-        <w:spacing w:line="276" w:lineRule="auto"/>
-        <w:rPr>
-          <w:b/>
-          <w:bCs/>
-        </w:rPr>
-      </w:pPr>
-      <w:r>
-        <w:rPr>
-          <w:b/>
-          <w:bCs/>
-        </w:rPr>
-        <w:lastRenderedPageBreak/>
-        <w:t xml:space="preserve">FPGA Implementation </w:t>
-      </w:r>
-    </w:p>
-    <w:p>
-      <w:pPr>
         <w:spacing w:line="360" w:lineRule="auto"/>
-        <w:jc w:val="both"/>
-        <w:rPr>
+        <w:rPr>
+          <w:b/>
+          <w:bCs/>
+        </w:rPr>
+      </w:pPr>
+      <w:r>
+        <w:rPr>
+          <w:b/>
+          <w:bCs/>
+        </w:rPr>
+        <w:t>TestBench</w:t>
+      </w:r>
+      <w:r>
+        <w:rPr>
+          <w:b/>
+          <w:bCs/>
+        </w:rPr>
+        <w:t xml:space="preserve"> </w:t>
+      </w:r>
+    </w:p>
+    <w:p>
+      <w:pPr>
+        <w:spacing w:after="0" w:line="360" w:lineRule="auto"/>
+        <w:jc w:val="both"/>
+        <w:rPr>
+          <w:b/>
+          <w:bCs/>
+          <w:sz w:val="24"/>
+          <w:szCs w:val="24"/>
+        </w:rPr>
+      </w:pPr>
+      <w:r>
+        <w:rPr>
+          <w:sz w:val="24"/>
+          <w:szCs w:val="24"/>
+        </w:rPr>
+        <w:t xml:space="preserve">In order to correctly observe the </w:t>
+      </w:r>
+      <w:r>
+        <w:rPr>
+          <w:b/>
+          <w:bCs/>
+          <w:sz w:val="24"/>
+          <w:szCs w:val="24"/>
+        </w:rPr>
+        <w:t>"Testbench,"</w:t>
+      </w:r>
+      <w:r>
+        <w:rPr>
+          <w:sz w:val="24"/>
+          <w:szCs w:val="24"/>
+        </w:rPr>
+        <w:t xml:space="preserve"> it is necessary to </w:t>
+      </w:r>
+      <w:r>
+        <w:rPr>
+          <w:b/>
+          <w:bCs/>
+          <w:sz w:val="24"/>
+          <w:szCs w:val="24"/>
+        </w:rPr>
+        <w:t>modify the "divisor" parameter.</w:t>
+      </w:r>
+      <w:r>
+        <w:rPr>
+          <w:sz w:val="24"/>
+          <w:szCs w:val="24"/>
+        </w:rPr>
+        <w:t xml:space="preserve"> In this case</w:t>
+      </w:r>
+      <w:r>
+        <w:rPr>
+          <w:b/>
+          <w:bCs/>
+          <w:sz w:val="24"/>
+          <w:szCs w:val="24"/>
+        </w:rPr>
+        <w:t>, to view it in the simulator</w:t>
+      </w:r>
+      <w:r>
+        <w:rPr>
+          <w:sz w:val="24"/>
+          <w:szCs w:val="24"/>
+        </w:rPr>
+        <w:t xml:space="preserve">, the </w:t>
+      </w:r>
+      <w:r>
+        <w:rPr>
+          <w:b/>
+          <w:bCs/>
+          <w:sz w:val="24"/>
+          <w:szCs w:val="24"/>
+        </w:rPr>
+        <w:t>value</w:t>
+      </w:r>
+      <w:r>
+        <w:rPr>
+          <w:sz w:val="24"/>
+          <w:szCs w:val="24"/>
+        </w:rPr>
+        <w:t xml:space="preserve"> must be small, such as </w:t>
+      </w:r>
+      <w:r>
+        <w:rPr>
+          <w:b/>
+          <w:bCs/>
+          <w:sz w:val="24"/>
+          <w:szCs w:val="24"/>
+        </w:rPr>
+        <w:t>"5" or "10."</w:t>
+      </w:r>
+      <w:r>
+        <w:rPr>
+          <w:b/>
+          <w:bCs/>
+          <w:sz w:val="24"/>
+          <w:szCs w:val="24"/>
+        </w:rPr>
+        <w:t xml:space="preserve"> This value is in the “semaforo_inteligente”.sv for see the correct simulation in </w:t>
+      </w:r>
+      <w:r>
+        <w:rPr>
+          <w:b/>
+          <w:bCs/>
+          <w:sz w:val="24"/>
+          <w:szCs w:val="24"/>
+        </w:rPr>
+        <w:sym w:font="Wingdings" w:char="F0E0"/>
+      </w:r>
+      <w:r>
+        <w:rPr>
+          <w:b/>
+          <w:bCs/>
+          <w:sz w:val="24"/>
+          <w:szCs w:val="24"/>
+        </w:rPr>
+        <w:t xml:space="preserve"> ModelSim Altera.</w:t>
+      </w:r>
+    </w:p>
+    <w:p>
+      <w:pPr>
+        <w:spacing w:after="0" w:line="360" w:lineRule="auto"/>
+        <w:jc w:val="both"/>
+        <w:rPr>
+          <w:b/>
+          <w:bCs/>
           <w:sz w:val="24"/>
           <w:szCs w:val="24"/>
         </w:rPr>
@@ -3086,18 +3280,18 @@
           <w:noProof/>
         </w:rPr>
         <w:drawing>
-          <wp:anchor distT="0" distB="0" distL="114300" distR="114300" simplePos="0" relativeHeight="251764736" behindDoc="0" locked="0" layoutInCell="1" allowOverlap="1" wp14:anchorId="7FF290B8" wp14:editId="16AA8DF8">
+          <wp:anchor distT="0" distB="0" distL="114300" distR="114300" simplePos="0" relativeHeight="251791360" behindDoc="0" locked="0" layoutInCell="1" allowOverlap="1" wp14:anchorId="421C0DC8" wp14:editId="2674215E">
             <wp:simplePos x="0" y="0"/>
             <wp:positionH relativeFrom="margin">
               <wp:align>center</wp:align>
             </wp:positionH>
             <wp:positionV relativeFrom="paragraph">
-              <wp:posOffset>556895</wp:posOffset>
+              <wp:posOffset>137160</wp:posOffset>
             </wp:positionV>
-            <wp:extent cx="3173730" cy="2113387"/>
-            <wp:effectExtent l="19050" t="19050" r="26670" b="20320"/>
+            <wp:extent cx="3965999" cy="2031365"/>
+            <wp:effectExtent l="19050" t="19050" r="15875" b="26035"/>
             <wp:wrapNone/>
-            <wp:docPr id="158835492" name="Imagen 1"/>
+            <wp:docPr id="582172987" name="Imagen 1"/>
             <wp:cNvGraphicFramePr>
               <a:graphicFrameLocks xmlns:a="http://schemas.openxmlformats.org/drawingml/2006/main" noChangeAspect="1"/>
             </wp:cNvGraphicFramePr>
@@ -3105,7 +3299,7 @@
               <a:graphicData uri="http://schemas.openxmlformats.org/drawingml/2006/picture">
                 <pic:pic xmlns:pic="http://schemas.openxmlformats.org/drawingml/2006/picture">
                   <pic:nvPicPr>
-                    <pic:cNvPr id="158835492" name=""/>
+                    <pic:cNvPr id="582172987" name=""/>
                     <pic:cNvPicPr/>
                   </pic:nvPicPr>
                   <pic:blipFill>
@@ -3123,7 +3317,7 @@
                   <pic:spPr>
                     <a:xfrm>
                       <a:off x="0" y="0"/>
-                      <a:ext cx="3173730" cy="2113387"/>
+                      <a:ext cx="3965999" cy="2031365"/>
                     </a:xfrm>
                     <a:prstGeom prst="rect">
                       <a:avLst/>
@@ -3146,17 +3340,10 @@
           </wp:anchor>
         </w:drawing>
       </w:r>
-      <w:r>
-        <w:rPr>
-          <w:sz w:val="24"/>
-          <w:szCs w:val="24"/>
-        </w:rPr>
-        <w:t>Once the program was completed, the compilation process was carried out in order to generate the pin assignment plan and correctly map the pins according to the program’s requirements.</w:t>
-      </w:r>
-    </w:p>
-    <w:p>
-      <w:pPr>
-        <w:spacing w:line="360" w:lineRule="auto"/>
+    </w:p>
+    <w:p>
+      <w:pPr>
+        <w:spacing w:after="0" w:line="360" w:lineRule="auto"/>
         <w:jc w:val="both"/>
         <w:rPr>
           <w:sz w:val="24"/>
@@ -3169,11 +3356,7 @@
     <w:p/>
     <w:p/>
     <w:p/>
-    <w:p>
-      <w:pPr>
-        <w:pStyle w:val="Descripcin"/>
-      </w:pPr>
-    </w:p>
+    <w:p/>
     <w:p>
       <w:pPr>
         <w:pStyle w:val="Descripcin"/>
@@ -3181,14 +3364,14 @@
         <w:rPr>
           <w:b/>
           <w:bCs/>
-          <w:color w:val="2F5496" w:themeColor="accent1" w:themeShade="BF"/>
-        </w:rPr>
-      </w:pPr>
-      <w:r>
-        <w:rPr>
-          <w:b/>
-          <w:bCs/>
-          <w:color w:val="2F5496" w:themeColor="accent1" w:themeShade="BF"/>
+          <w:color w:val="002060"/>
+        </w:rPr>
+      </w:pPr>
+      <w:r>
+        <w:rPr>
+          <w:b/>
+          <w:bCs/>
+          <w:color w:val="002060"/>
         </w:rPr>
         <w:t xml:space="preserve">Figure: </w:t>
       </w:r>
@@ -3196,7 +3379,7 @@
         <w:rPr>
           <w:b/>
           <w:bCs/>
-          <w:color w:val="2F5496" w:themeColor="accent1" w:themeShade="BF"/>
+          <w:color w:val="002060"/>
         </w:rPr>
         <w:fldChar w:fldCharType="begin"/>
       </w:r>
@@ -3204,7 +3387,7 @@
         <w:rPr>
           <w:b/>
           <w:bCs/>
-          <w:color w:val="2F5496" w:themeColor="accent1" w:themeShade="BF"/>
+          <w:color w:val="002060"/>
         </w:rPr>
         <w:instrText xml:space="preserve"> SEQ Figure: \* ARABIC </w:instrText>
       </w:r>
@@ -3212,7 +3395,7 @@
         <w:rPr>
           <w:b/>
           <w:bCs/>
-          <w:color w:val="2F5496" w:themeColor="accent1" w:themeShade="BF"/>
+          <w:color w:val="002060"/>
         </w:rPr>
         <w:fldChar w:fldCharType="separate"/>
       </w:r>
@@ -3221,7 +3404,471 @@
           <w:b/>
           <w:bCs/>
           <w:noProof/>
-          <w:color w:val="2F5496" w:themeColor="accent1" w:themeShade="BF"/>
+          <w:color w:val="002060"/>
+        </w:rPr>
+        <w:t>7</w:t>
+      </w:r>
+      <w:r>
+        <w:rPr>
+          <w:b/>
+          <w:bCs/>
+          <w:color w:val="002060"/>
+        </w:rPr>
+        <w:fldChar w:fldCharType="end"/>
+      </w:r>
+      <w:r>
+        <w:rPr>
+          <w:b/>
+          <w:bCs/>
+          <w:color w:val="002060"/>
+        </w:rPr>
+        <w:t xml:space="preserve"> Divisor Value --&gt; Testbench</w:t>
+      </w:r>
+    </w:p>
+    <w:p/>
+    <w:p>
+      <w:pPr>
+        <w:spacing w:line="360" w:lineRule="auto"/>
+        <w:jc w:val="both"/>
+        <w:rPr>
+          <w:sz w:val="24"/>
+          <w:szCs w:val="24"/>
+        </w:rPr>
+      </w:pPr>
+      <w:r>
+        <w:rPr>
+          <w:sz w:val="24"/>
+          <w:szCs w:val="24"/>
+        </w:rPr>
+        <w:t>Once the parameter is modified and the "testbench" program is assigned in the assignments, it is possible to see the representation in the simulator, such that the messages displayed with the values are shown as follows in the terminal.</w:t>
+      </w:r>
+    </w:p>
+    <w:p>
+      <w:pPr>
+        <w:pStyle w:val="Descripcin"/>
+      </w:pPr>
+    </w:p>
+    <w:p>
+      <w:pPr>
+        <w:pStyle w:val="Descripcin"/>
+        <w:rPr>
+          <w:sz w:val="24"/>
+          <w:szCs w:val="24"/>
+        </w:rPr>
+      </w:pPr>
+      <w:r>
+        <w:rPr>
+          <w:noProof/>
+        </w:rPr>
+        <w:lastRenderedPageBreak/>
+        <mc:AlternateContent>
+          <mc:Choice Requires="wpg">
+            <w:drawing>
+              <wp:anchor distT="0" distB="0" distL="114300" distR="114300" simplePos="0" relativeHeight="251795456" behindDoc="0" locked="0" layoutInCell="1" allowOverlap="1" wp14:anchorId="60A37F4F" wp14:editId="5030D17D">
+                <wp:simplePos x="0" y="0"/>
+                <wp:positionH relativeFrom="margin">
+                  <wp:align>center</wp:align>
+                </wp:positionH>
+                <wp:positionV relativeFrom="paragraph">
+                  <wp:posOffset>26670</wp:posOffset>
+                </wp:positionV>
+                <wp:extent cx="5497830" cy="3463290"/>
+                <wp:effectExtent l="19050" t="19050" r="26670" b="22860"/>
+                <wp:wrapNone/>
+                <wp:docPr id="2007310647" name="Grupo 3"/>
+                <wp:cNvGraphicFramePr/>
+                <a:graphic xmlns:a="http://schemas.openxmlformats.org/drawingml/2006/main">
+                  <a:graphicData uri="http://schemas.microsoft.com/office/word/2010/wordprocessingGroup">
+                    <wpg:wgp>
+                      <wpg:cNvGrpSpPr/>
+                      <wpg:grpSpPr>
+                        <a:xfrm>
+                          <a:off x="0" y="0"/>
+                          <a:ext cx="5497830" cy="3463290"/>
+                          <a:chOff x="0" y="0"/>
+                          <a:chExt cx="5543550" cy="4267200"/>
+                        </a:xfrm>
+                      </wpg:grpSpPr>
+                      <pic:pic xmlns:pic="http://schemas.openxmlformats.org/drawingml/2006/picture">
+                        <pic:nvPicPr>
+                          <pic:cNvPr id="2052743808" name="Imagen 1"/>
+                          <pic:cNvPicPr>
+                            <a:picLocks noChangeAspect="1"/>
+                          </pic:cNvPicPr>
+                        </pic:nvPicPr>
+                        <pic:blipFill rotWithShape="1">
+                          <a:blip r:embed="rId24">
+                            <a:extLst>
+                              <a:ext uri="{28A0092B-C50C-407E-A947-70E740481C1C}">
+                                <a14:useLocalDpi xmlns:a14="http://schemas.microsoft.com/office/drawing/2010/main" val="0"/>
+                              </a:ext>
+                            </a:extLst>
+                          </a:blip>
+                          <a:srcRect r="5953" b="35647"/>
+                          <a:stretch>
+                            <a:fillRect/>
+                          </a:stretch>
+                        </pic:blipFill>
+                        <pic:spPr bwMode="auto">
+                          <a:xfrm>
+                            <a:off x="2747010" y="502920"/>
+                            <a:ext cx="2712720" cy="1554480"/>
+                          </a:xfrm>
+                          <a:prstGeom prst="rect">
+                            <a:avLst/>
+                          </a:prstGeom>
+                          <a:ln>
+                            <a:solidFill>
+                              <a:schemeClr val="tx1"/>
+                            </a:solidFill>
+                          </a:ln>
+                          <a:extLst>
+                            <a:ext uri="{53640926-AAD7-44D8-BBD7-CCE9431645EC}">
+                              <a14:shadowObscured xmlns:a14="http://schemas.microsoft.com/office/drawing/2010/main"/>
+                            </a:ext>
+                          </a:extLst>
+                        </pic:spPr>
+                      </pic:pic>
+                      <pic:pic xmlns:pic="http://schemas.openxmlformats.org/drawingml/2006/picture">
+                        <pic:nvPicPr>
+                          <pic:cNvPr id="90808767" name="Imagen 1"/>
+                          <pic:cNvPicPr>
+                            <a:picLocks noChangeAspect="1"/>
+                          </pic:cNvPicPr>
+                        </pic:nvPicPr>
+                        <pic:blipFill rotWithShape="1">
+                          <a:blip r:embed="rId25">
+                            <a:extLst>
+                              <a:ext uri="{28A0092B-C50C-407E-A947-70E740481C1C}">
+                                <a14:useLocalDpi xmlns:a14="http://schemas.microsoft.com/office/drawing/2010/main" val="0"/>
+                              </a:ext>
+                            </a:extLst>
+                          </a:blip>
+                          <a:srcRect b="5264"/>
+                          <a:stretch>
+                            <a:fillRect/>
+                          </a:stretch>
+                        </pic:blipFill>
+                        <pic:spPr bwMode="auto">
+                          <a:xfrm>
+                            <a:off x="0" y="2564130"/>
+                            <a:ext cx="5543550" cy="1703070"/>
+                          </a:xfrm>
+                          <a:prstGeom prst="rect">
+                            <a:avLst/>
+                          </a:prstGeom>
+                          <a:ln w="9525" cap="flat" cmpd="sng" algn="ctr">
+                            <a:solidFill>
+                              <a:schemeClr val="tx1"/>
+                            </a:solidFill>
+                            <a:prstDash val="solid"/>
+                            <a:round/>
+                            <a:headEnd type="none" w="med" len="med"/>
+                            <a:tailEnd type="none" w="med" len="med"/>
+                            <a:extLst>
+                              <a:ext uri="{C807C97D-BFC1-408E-A445-0C87EB9F89A2}">
+                                <ask:lineSketchStyleProps xmlns:ask="http://schemas.microsoft.com/office/drawing/2018/sketchyshapes" sd="0">
+                                  <a:custGeom>
+                                    <a:avLst/>
+                                    <a:gdLst/>
+                                    <a:ahLst/>
+                                    <a:cxnLst/>
+                                    <a:rect l="0" t="0" r="0" b="0"/>
+                                    <a:pathLst/>
+                                  </a:custGeom>
+                                  <ask:type/>
+                                </ask:lineSketchStyleProps>
+                              </a:ext>
+                            </a:extLst>
+                          </a:ln>
+                          <a:extLst>
+                            <a:ext uri="{53640926-AAD7-44D8-BBD7-CCE9431645EC}">
+                              <a14:shadowObscured xmlns:a14="http://schemas.microsoft.com/office/drawing/2010/main"/>
+                            </a:ext>
+                          </a:extLst>
+                        </pic:spPr>
+                      </pic:pic>
+                      <pic:pic xmlns:pic="http://schemas.openxmlformats.org/drawingml/2006/picture">
+                        <pic:nvPicPr>
+                          <pic:cNvPr id="537115573" name="Imagen 1"/>
+                          <pic:cNvPicPr>
+                            <a:picLocks noChangeAspect="1"/>
+                          </pic:cNvPicPr>
+                        </pic:nvPicPr>
+                        <pic:blipFill rotWithShape="1">
+                          <a:blip r:embed="rId26">
+                            <a:extLst>
+                              <a:ext uri="{28A0092B-C50C-407E-A947-70E740481C1C}">
+                                <a14:useLocalDpi xmlns:a14="http://schemas.microsoft.com/office/drawing/2010/main" val="0"/>
+                              </a:ext>
+                            </a:extLst>
+                          </a:blip>
+                          <a:srcRect r="22392" b="8425"/>
+                          <a:stretch>
+                            <a:fillRect/>
+                          </a:stretch>
+                        </pic:blipFill>
+                        <pic:spPr bwMode="auto">
+                          <a:xfrm>
+                            <a:off x="49530" y="0"/>
+                            <a:ext cx="2446020" cy="2461260"/>
+                          </a:xfrm>
+                          <a:prstGeom prst="rect">
+                            <a:avLst/>
+                          </a:prstGeom>
+                          <a:ln>
+                            <a:solidFill>
+                              <a:schemeClr val="tx1"/>
+                            </a:solidFill>
+                          </a:ln>
+                          <a:extLst>
+                            <a:ext uri="{53640926-AAD7-44D8-BBD7-CCE9431645EC}">
+                              <a14:shadowObscured xmlns:a14="http://schemas.microsoft.com/office/drawing/2010/main"/>
+                            </a:ext>
+                          </a:extLst>
+                        </pic:spPr>
+                      </pic:pic>
+                    </wpg:wgp>
+                  </a:graphicData>
+                </a:graphic>
+                <wp14:sizeRelH relativeFrom="margin">
+                  <wp14:pctWidth>0</wp14:pctWidth>
+                </wp14:sizeRelH>
+                <wp14:sizeRelV relativeFrom="margin">
+                  <wp14:pctHeight>0</wp14:pctHeight>
+                </wp14:sizeRelV>
+              </wp:anchor>
+            </w:drawing>
+          </mc:Choice>
+          <mc:Fallback>
+            <w:pict>
+              <v:group w14:anchorId="283472C8" id="Grupo 3" o:spid="_x0000_s1026" style="position:absolute;margin-left:0;margin-top:2.1pt;width:432.9pt;height:272.7pt;z-index:251795456;mso-position-horizontal:center;mso-position-horizontal-relative:margin;mso-width-relative:margin;mso-height-relative:margin" coordsize="55435,42672" o:gfxdata="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">
+                <v:shapetype id="_x0000_t75" coordsize="21600,21600" o:spt="75" o:preferrelative="t" path="m@4@5l@4@11@9@11@9@5xe" filled="f" stroked="f">
+                  <v:stroke joinstyle="miter"/>
+                  <v:formulas>
+                    <v:f eqn="if lineDrawn pixelLineWidth 0"/>
+                    <v:f eqn="sum @0 1 0"/>
+                    <v:f eqn="sum 0 0 @1"/>
+                    <v:f eqn="prod @2 1 2"/>
+                    <v:f eqn="prod @3 21600 pixelWidth"/>
+                    <v:f eqn="prod @3 21600 pixelHeight"/>
+                    <v:f eqn="sum @0 0 1"/>
+                    <v:f eqn="prod @6 1 2"/>
+                    <v:f eqn="prod @7 21600 pixelWidth"/>
+                    <v:f eqn="sum @8 21600 0"/>
+                    <v:f eqn="prod @7 21600 pixelHeight"/>
+                    <v:f eqn="sum @10 21600 0"/>
+                  </v:formulas>
+                  <v:path o:extrusionok="f" gradientshapeok="t" o:connecttype="rect"/>
+                  <o:lock v:ext="edit" aspectratio="t"/>
+                </v:shapetype>
+                <v:shape id="Imagen 1" o:spid="_x0000_s1027" type="#_x0000_t75" style="position:absolute;left:27470;top:5029;width:27127;height:15545;visibility:visible;mso-wrap-style:square" o:gfxdata="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" stroked="t" strokecolor="black [3213]">
+                  <v:imagedata r:id="rId27" o:title="" cropbottom="23362f" cropright="3901f"/>
+                  <v:path arrowok="t"/>
+                </v:shape>
+                <v:shape id="Imagen 1" o:spid="_x0000_s1028" type="#_x0000_t75" style="position:absolute;top:25641;width:55435;height:17031;visibility:visible;mso-wrap-style:square" o:gfxdata="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" stroked="t" strokecolor="black [3213]">
+                  <v:stroke joinstyle="round"/>
+                  <v:imagedata r:id="rId28" o:title="" cropbottom="3450f"/>
+                  <v:path arrowok="t"/>
+                </v:shape>
+                <v:shape id="Imagen 1" o:spid="_x0000_s1029" type="#_x0000_t75" style="position:absolute;left:495;width:24460;height:24612;visibility:visible;mso-wrap-style:square" o:gfxdata="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" stroked="t" strokecolor="black [3213]">
+                  <v:imagedata r:id="rId29" o:title="" cropbottom="5521f" cropright="14675f"/>
+                  <v:path arrowok="t"/>
+                </v:shape>
+                <w10:wrap anchorx="margin"/>
+              </v:group>
+            </w:pict>
+          </mc:Fallback>
+        </mc:AlternateContent>
+      </w:r>
+      <w:r>
+        <w:tab/>
+      </w:r>
+    </w:p>
+    <w:p>
+      <w:pPr>
+        <w:rPr>
+          <w:sz w:val="24"/>
+          <w:szCs w:val="24"/>
+        </w:rPr>
+      </w:pPr>
+    </w:p>
+    <w:p>
+      <w:pPr>
+        <w:rPr>
+          <w:b/>
+          <w:bCs/>
+          <w:i/>
+          <w:iCs/>
+          <w:sz w:val="24"/>
+          <w:szCs w:val="24"/>
+        </w:rPr>
+      </w:pPr>
+      <w:r>
+        <w:rPr>
+          <w:b/>
+          <w:bCs/>
+          <w:i/>
+          <w:iCs/>
+          <w:sz w:val="24"/>
+          <w:szCs w:val="24"/>
+        </w:rPr>
+        <w:t xml:space="preserve"> </w:t>
+      </w:r>
+    </w:p>
+    <w:p>
+      <w:pPr>
+        <w:tabs>
+          <w:tab w:val="left" w:pos="6192"/>
+        </w:tabs>
+        <w:rPr>
+          <w:b/>
+          <w:bCs/>
+          <w:i/>
+          <w:iCs/>
+          <w:sz w:val="24"/>
+          <w:szCs w:val="24"/>
+        </w:rPr>
+      </w:pPr>
+      <w:r>
+        <w:rPr>
+          <w:b/>
+          <w:bCs/>
+          <w:i/>
+          <w:iCs/>
+          <w:sz w:val="24"/>
+          <w:szCs w:val="24"/>
+        </w:rPr>
+        <w:tab/>
+      </w:r>
+    </w:p>
+    <w:p>
+      <w:pPr>
+        <w:rPr>
+          <w:b/>
+          <w:bCs/>
+          <w:i/>
+          <w:iCs/>
+          <w:sz w:val="24"/>
+          <w:szCs w:val="24"/>
+        </w:rPr>
+      </w:pPr>
+    </w:p>
+    <w:p>
+      <w:pPr>
+        <w:rPr>
+          <w:b/>
+          <w:bCs/>
+          <w:i/>
+          <w:iCs/>
+          <w:sz w:val="24"/>
+          <w:szCs w:val="24"/>
+        </w:rPr>
+      </w:pPr>
+    </w:p>
+    <w:p>
+      <w:pPr>
+        <w:rPr>
+          <w:b/>
+          <w:bCs/>
+          <w:i/>
+          <w:iCs/>
+          <w:sz w:val="24"/>
+          <w:szCs w:val="24"/>
+        </w:rPr>
+      </w:pPr>
+    </w:p>
+    <w:p>
+      <w:pPr>
+        <w:rPr>
+          <w:sz w:val="24"/>
+          <w:szCs w:val="24"/>
+        </w:rPr>
+      </w:pPr>
+    </w:p>
+    <w:p>
+      <w:pPr>
+        <w:rPr>
+          <w:sz w:val="24"/>
+          <w:szCs w:val="24"/>
+        </w:rPr>
+      </w:pPr>
+    </w:p>
+    <w:p>
+      <w:pPr>
+        <w:rPr>
+          <w:sz w:val="24"/>
+          <w:szCs w:val="24"/>
+        </w:rPr>
+      </w:pPr>
+    </w:p>
+    <w:p>
+      <w:pPr>
+        <w:rPr>
+          <w:sz w:val="24"/>
+          <w:szCs w:val="24"/>
+        </w:rPr>
+      </w:pPr>
+    </w:p>
+    <w:p>
+      <w:pPr>
+        <w:pStyle w:val="Descripcin"/>
+        <w:jc w:val="center"/>
+        <w:rPr>
+          <w:b/>
+          <w:bCs/>
+          <w:color w:val="002060"/>
+        </w:rPr>
+      </w:pPr>
+    </w:p>
+    <w:p>
+      <w:pPr>
+        <w:pStyle w:val="Descripcin"/>
+        <w:jc w:val="center"/>
+        <w:rPr>
+          <w:b/>
+          <w:bCs/>
+          <w:color w:val="002060"/>
+        </w:rPr>
+      </w:pPr>
+      <w:r>
+        <w:rPr>
+          <w:b/>
+          <w:bCs/>
+          <w:color w:val="002060"/>
+        </w:rPr>
+        <w:t xml:space="preserve">Figure: </w:t>
+      </w:r>
+      <w:r>
+        <w:rPr>
+          <w:b/>
+          <w:bCs/>
+          <w:color w:val="002060"/>
+        </w:rPr>
+        <w:fldChar w:fldCharType="begin"/>
+      </w:r>
+      <w:r>
+        <w:rPr>
+          <w:b/>
+          <w:bCs/>
+          <w:color w:val="002060"/>
+        </w:rPr>
+        <w:instrText xml:space="preserve"> SEQ Figure: \* ARABIC </w:instrText>
+      </w:r>
+      <w:r>
+        <w:rPr>
+          <w:b/>
+          <w:bCs/>
+          <w:color w:val="002060"/>
+        </w:rPr>
+        <w:fldChar w:fldCharType="separate"/>
+      </w:r>
+      <w:r>
+        <w:rPr>
+          <w:b/>
+          <w:bCs/>
+          <w:noProof/>
+          <w:color w:val="002060"/>
         </w:rPr>
         <w:t>8</w:t>
       </w:r>
@@ -3229,7 +3876,7 @@
         <w:rPr>
           <w:b/>
           <w:bCs/>
-          <w:color w:val="2F5496" w:themeColor="accent1" w:themeShade="BF"/>
+          <w:color w:val="002060"/>
         </w:rPr>
         <w:fldChar w:fldCharType="end"/>
       </w:r>
@@ -3237,93 +3884,374 @@
         <w:rPr>
           <w:b/>
           <w:bCs/>
-          <w:color w:val="2F5496" w:themeColor="accent1" w:themeShade="BF"/>
-        </w:rPr>
-        <w:t xml:space="preserve"> Compilation Report</w:t>
-      </w:r>
+          <w:color w:val="002060"/>
+        </w:rPr>
+        <w:t xml:space="preserve"> ModelSim Semaphore</w:t>
+      </w:r>
+    </w:p>
+    <w:p>
+      <w:pPr>
+        <w:pStyle w:val="Ttulo1"/>
+        <w:spacing w:line="360" w:lineRule="auto"/>
+        <w:rPr>
+          <w:b/>
+          <w:bCs/>
+        </w:rPr>
+      </w:pPr>
+      <w:r>
+        <w:rPr>
+          <w:b/>
+          <w:bCs/>
+        </w:rPr>
+        <w:t>Vivado</w:t>
+      </w:r>
+    </w:p>
+    <w:p>
+      <w:pPr>
+        <w:tabs>
+          <w:tab w:val="left" w:pos="5700"/>
+        </w:tabs>
+        <w:spacing w:line="360" w:lineRule="auto"/>
+        <w:jc w:val="both"/>
+        <w:rPr>
+          <w:sz w:val="24"/>
+          <w:szCs w:val="24"/>
+        </w:rPr>
+      </w:pPr>
+      <w:r>
+        <w:rPr>
+          <w:sz w:val="24"/>
+          <w:szCs w:val="24"/>
+        </w:rPr>
+        <w:t xml:space="preserve">After </w:t>
+      </w:r>
+      <w:r>
+        <w:rPr>
+          <w:sz w:val="24"/>
+          <w:szCs w:val="24"/>
+        </w:rPr>
+        <w:t>finish with the Quartus environment, we start a create a proyect in “Vivado Tool” in this case is the 2024.2 version, here we create a new proyect with the previous files for example:</w:t>
+      </w:r>
+    </w:p>
+    <w:p>
+      <w:pPr>
+        <w:tabs>
+          <w:tab w:val="left" w:pos="5700"/>
+        </w:tabs>
+        <w:spacing w:line="360" w:lineRule="auto"/>
+        <w:jc w:val="both"/>
+      </w:pPr>
+      <w:r>
+        <w:rPr>
+          <w:noProof/>
+        </w:rPr>
+        <mc:AlternateContent>
+          <mc:Choice Requires="wpg">
+            <w:drawing>
+              <wp:anchor distT="0" distB="0" distL="114300" distR="114300" simplePos="0" relativeHeight="251799552" behindDoc="0" locked="0" layoutInCell="1" allowOverlap="1" wp14:anchorId="73C86837" wp14:editId="7BE1870B">
+                <wp:simplePos x="0" y="0"/>
+                <wp:positionH relativeFrom="margin">
+                  <wp:align>center</wp:align>
+                </wp:positionH>
+                <wp:positionV relativeFrom="paragraph">
+                  <wp:posOffset>23495</wp:posOffset>
+                </wp:positionV>
+                <wp:extent cx="5695950" cy="2745831"/>
+                <wp:effectExtent l="19050" t="19050" r="19050" b="16510"/>
+                <wp:wrapNone/>
+                <wp:docPr id="1904077272" name="Grupo 4"/>
+                <wp:cNvGraphicFramePr/>
+                <a:graphic xmlns:a="http://schemas.openxmlformats.org/drawingml/2006/main">
+                  <a:graphicData uri="http://schemas.microsoft.com/office/word/2010/wordprocessingGroup">
+                    <wpg:wgp>
+                      <wpg:cNvGrpSpPr/>
+                      <wpg:grpSpPr>
+                        <a:xfrm>
+                          <a:off x="0" y="0"/>
+                          <a:ext cx="5695950" cy="2745831"/>
+                          <a:chOff x="-6698" y="0"/>
+                          <a:chExt cx="6058478" cy="2616738"/>
+                        </a:xfrm>
+                      </wpg:grpSpPr>
+                      <pic:pic xmlns:pic="http://schemas.openxmlformats.org/drawingml/2006/picture">
+                        <pic:nvPicPr>
+                          <pic:cNvPr id="1613417129" name="Imagen 1"/>
+                          <pic:cNvPicPr>
+                            <a:picLocks noChangeAspect="1"/>
+                          </pic:cNvPicPr>
+                        </pic:nvPicPr>
+                        <pic:blipFill rotWithShape="1">
+                          <a:blip r:embed="rId30" cstate="print">
+                            <a:extLst>
+                              <a:ext uri="{28A0092B-C50C-407E-A947-70E740481C1C}">
+                                <a14:useLocalDpi xmlns:a14="http://schemas.microsoft.com/office/drawing/2010/main" val="0"/>
+                              </a:ext>
+                            </a:extLst>
+                          </a:blip>
+                          <a:srcRect t="1" b="63941"/>
+                          <a:stretch>
+                            <a:fillRect/>
+                          </a:stretch>
+                        </pic:blipFill>
+                        <pic:spPr bwMode="auto">
+                          <a:xfrm>
+                            <a:off x="0" y="0"/>
+                            <a:ext cx="6038215" cy="1386840"/>
+                          </a:xfrm>
+                          <a:prstGeom prst="rect">
+                            <a:avLst/>
+                          </a:prstGeom>
+                          <a:ln>
+                            <a:solidFill>
+                              <a:schemeClr val="tx1"/>
+                            </a:solidFill>
+                          </a:ln>
+                          <a:extLst>
+                            <a:ext uri="{53640926-AAD7-44D8-BBD7-CCE9431645EC}">
+                              <a14:shadowObscured xmlns:a14="http://schemas.microsoft.com/office/drawing/2010/main"/>
+                            </a:ext>
+                          </a:extLst>
+                        </pic:spPr>
+                      </pic:pic>
+                      <pic:pic xmlns:pic="http://schemas.openxmlformats.org/drawingml/2006/picture">
+                        <pic:nvPicPr>
+                          <pic:cNvPr id="907275246" name="Imagen 1"/>
+                          <pic:cNvPicPr>
+                            <a:picLocks noChangeAspect="1"/>
+                          </pic:cNvPicPr>
+                        </pic:nvPicPr>
+                        <pic:blipFill rotWithShape="1">
+                          <a:blip r:embed="rId30" cstate="print">
+                            <a:extLst>
+                              <a:ext uri="{28A0092B-C50C-407E-A947-70E740481C1C}">
+                                <a14:useLocalDpi xmlns:a14="http://schemas.microsoft.com/office/drawing/2010/main" val="0"/>
+                              </a:ext>
+                            </a:extLst>
+                          </a:blip>
+                          <a:srcRect t="65975" b="1533"/>
+                          <a:stretch>
+                            <a:fillRect/>
+                          </a:stretch>
+                        </pic:blipFill>
+                        <pic:spPr bwMode="auto">
+                          <a:xfrm>
+                            <a:off x="-6698" y="1386743"/>
+                            <a:ext cx="6058478" cy="1229995"/>
+                          </a:xfrm>
+                          <a:prstGeom prst="rect">
+                            <a:avLst/>
+                          </a:prstGeom>
+                          <a:ln>
+                            <a:solidFill>
+                              <a:schemeClr val="tx1"/>
+                            </a:solidFill>
+                          </a:ln>
+                          <a:extLst>
+                            <a:ext uri="{53640926-AAD7-44D8-BBD7-CCE9431645EC}">
+                              <a14:shadowObscured xmlns:a14="http://schemas.microsoft.com/office/drawing/2010/main"/>
+                            </a:ext>
+                          </a:extLst>
+                        </pic:spPr>
+                      </pic:pic>
+                    </wpg:wgp>
+                  </a:graphicData>
+                </a:graphic>
+                <wp14:sizeRelH relativeFrom="margin">
+                  <wp14:pctWidth>0</wp14:pctWidth>
+                </wp14:sizeRelH>
+                <wp14:sizeRelV relativeFrom="margin">
+                  <wp14:pctHeight>0</wp14:pctHeight>
+                </wp14:sizeRelV>
+              </wp:anchor>
+            </w:drawing>
+          </mc:Choice>
+          <mc:Fallback>
+            <w:pict>
+              <v:group w14:anchorId="659E0667" id="Grupo 4" o:spid="_x0000_s1026" style="position:absolute;margin-left:0;margin-top:1.85pt;width:448.5pt;height:216.2pt;z-index:251799552;mso-position-horizontal:center;mso-position-horizontal-relative:margin;mso-width-relative:margin;mso-height-relative:margin" coordorigin="-66" coordsize="60584,26167" o:gfxdata="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">
+                <v:shape id="Imagen 1" o:spid="_x0000_s1027" type="#_x0000_t75" style="position:absolute;width:60382;height:13868;visibility:visible;mso-wrap-style:square" o:gfxdata="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" stroked="t" strokecolor="black [3213]">
+                  <v:imagedata r:id="rId31" o:title="" croptop="1f" cropbottom="41904f"/>
+                  <v:path arrowok="t"/>
+                </v:shape>
+                <v:shape id="Imagen 1" o:spid="_x0000_s1028" type="#_x0000_t75" style="position:absolute;left:-66;top:13867;width:60583;height:12300;visibility:visible;mso-wrap-style:square" o:gfxdata="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" stroked="t" strokecolor="black [3213]">
+                  <v:imagedata r:id="rId31" o:title="" croptop="43237f" cropbottom="1005f"/>
+                  <v:path arrowok="t"/>
+                </v:shape>
+                <w10:wrap anchorx="margin"/>
+              </v:group>
+            </w:pict>
+          </mc:Fallback>
+        </mc:AlternateContent>
+      </w:r>
+      <w:r>
+        <w:tab/>
+      </w:r>
+    </w:p>
+    <w:p>
+      <w:pPr>
+        <w:tabs>
+          <w:tab w:val="left" w:pos="5700"/>
+        </w:tabs>
+      </w:pPr>
+    </w:p>
+    <w:p>
+      <w:pPr>
+        <w:tabs>
+          <w:tab w:val="left" w:pos="5700"/>
+        </w:tabs>
+      </w:pPr>
+    </w:p>
+    <w:p>
+      <w:pPr>
+        <w:tabs>
+          <w:tab w:val="left" w:pos="5700"/>
+        </w:tabs>
+      </w:pPr>
+    </w:p>
+    <w:p>
+      <w:pPr>
+        <w:tabs>
+          <w:tab w:val="left" w:pos="5700"/>
+        </w:tabs>
+      </w:pPr>
+    </w:p>
+    <w:p>
+      <w:pPr>
+        <w:tabs>
+          <w:tab w:val="left" w:pos="5700"/>
+        </w:tabs>
+      </w:pPr>
+    </w:p>
+    <w:p>
+      <w:pPr>
+        <w:tabs>
+          <w:tab w:val="left" w:pos="5700"/>
+        </w:tabs>
+      </w:pPr>
+    </w:p>
+    <w:p>
+      <w:pPr>
+        <w:tabs>
+          <w:tab w:val="left" w:pos="5700"/>
+        </w:tabs>
+      </w:pPr>
+    </w:p>
+    <w:p>
+      <w:pPr>
+        <w:tabs>
+          <w:tab w:val="left" w:pos="5700"/>
+        </w:tabs>
+      </w:pPr>
     </w:p>
     <w:p>
       <w:pPr>
         <w:pStyle w:val="Descripcin"/>
-      </w:pPr>
-      <w:r>
-        <w:tab/>
-      </w:r>
-    </w:p>
-    <w:p>
-      <w:pPr>
-        <w:rPr>
-          <w:sz w:val="24"/>
-          <w:szCs w:val="24"/>
-        </w:rPr>
-      </w:pPr>
-      <w:r>
-        <w:rPr>
-          <w:sz w:val="24"/>
-          <w:szCs w:val="24"/>
-        </w:rPr>
-        <w:t xml:space="preserve">The pins </w:t>
-      </w:r>
-      <w:r>
-        <w:rPr>
-          <w:sz w:val="24"/>
-          <w:szCs w:val="24"/>
-        </w:rPr>
-        <w:t xml:space="preserve">consideration </w:t>
-      </w:r>
-      <w:r>
-        <w:rPr>
-          <w:sz w:val="24"/>
-          <w:szCs w:val="24"/>
-        </w:rPr>
-        <w:t>was</w:t>
-      </w:r>
-      <w:r>
-        <w:rPr>
-          <w:sz w:val="24"/>
-          <w:szCs w:val="24"/>
-        </w:rPr>
-        <w:t xml:space="preserve"> assigned as following</w:t>
-      </w:r>
-      <w:r>
-        <w:rPr>
-          <w:sz w:val="24"/>
-          <w:szCs w:val="24"/>
-        </w:rPr>
-        <w:t xml:space="preserve">, in this case </w:t>
-      </w:r>
-      <w:r>
-        <w:rPr>
-          <w:sz w:val="24"/>
-          <w:szCs w:val="24"/>
-        </w:rPr>
-        <w:t>we add different elements for complete the functionality in the FPGA.</w:t>
-      </w:r>
-    </w:p>
-    <w:p>
-      <w:pPr>
-        <w:rPr>
-          <w:sz w:val="24"/>
-          <w:szCs w:val="24"/>
-        </w:rPr>
-      </w:pPr>
-      <w:r>
-        <w:rPr>
+        <w:jc w:val="center"/>
+        <w:rPr>
+          <w:b/>
+          <w:bCs/>
+        </w:rPr>
+      </w:pPr>
+    </w:p>
+    <w:p>
+      <w:pPr>
+        <w:pStyle w:val="Descripcin"/>
+        <w:jc w:val="center"/>
+        <w:rPr>
+          <w:b/>
+          <w:bCs/>
+          <w:color w:val="002060"/>
+        </w:rPr>
+      </w:pPr>
+      <w:r>
+        <w:rPr>
+          <w:b/>
+          <w:bCs/>
+          <w:color w:val="002060"/>
+        </w:rPr>
+        <w:t xml:space="preserve">Figure: </w:t>
+      </w:r>
+      <w:r>
+        <w:rPr>
+          <w:b/>
+          <w:bCs/>
+          <w:color w:val="002060"/>
+        </w:rPr>
+        <w:fldChar w:fldCharType="begin"/>
+      </w:r>
+      <w:r>
+        <w:rPr>
+          <w:b/>
+          <w:bCs/>
+          <w:color w:val="002060"/>
+        </w:rPr>
+        <w:instrText xml:space="preserve"> SEQ Figure: \* ARABIC </w:instrText>
+      </w:r>
+      <w:r>
+        <w:rPr>
+          <w:b/>
+          <w:bCs/>
+          <w:color w:val="002060"/>
+        </w:rPr>
+        <w:fldChar w:fldCharType="separate"/>
+      </w:r>
+      <w:r>
+        <w:rPr>
+          <w:b/>
+          <w:bCs/>
           <w:noProof/>
+          <w:color w:val="002060"/>
+        </w:rPr>
+        <w:t>9</w:t>
+      </w:r>
+      <w:r>
+        <w:rPr>
+          <w:b/>
+          <w:bCs/>
+          <w:color w:val="002060"/>
+        </w:rPr>
+        <w:fldChar w:fldCharType="end"/>
+      </w:r>
+      <w:r>
+        <w:rPr>
+          <w:b/>
+          <w:bCs/>
+          <w:color w:val="002060"/>
+        </w:rPr>
+        <w:t xml:space="preserve"> Vivado New Proyect</w:t>
+      </w:r>
+    </w:p>
+    <w:p>
+      <w:pPr>
+        <w:spacing w:line="360" w:lineRule="auto"/>
+        <w:jc w:val="both"/>
+      </w:pPr>
+    </w:p>
+    <w:p>
+      <w:pPr>
+        <w:spacing w:line="360" w:lineRule="auto"/>
+        <w:jc w:val="both"/>
+        <w:rPr>
+          <w:sz w:val="24"/>
+          <w:szCs w:val="24"/>
+        </w:rPr>
+      </w:pPr>
+      <w:r>
+        <w:rPr>
+          <w:noProof/>
         </w:rPr>
         <w:drawing>
-          <wp:anchor distT="0" distB="0" distL="114300" distR="114300" simplePos="0" relativeHeight="251766784" behindDoc="0" locked="0" layoutInCell="1" allowOverlap="1" wp14:anchorId="19C6C009" wp14:editId="53340239">
+          <wp:anchor distT="0" distB="0" distL="114300" distR="114300" simplePos="0" relativeHeight="251800576" behindDoc="0" locked="0" layoutInCell="1" allowOverlap="1" wp14:anchorId="0387B6A7" wp14:editId="16069AA6">
             <wp:simplePos x="0" y="0"/>
             <wp:positionH relativeFrom="margin">
-              <wp:posOffset>2956560</wp:posOffset>
+              <wp:align>center</wp:align>
             </wp:positionH>
             <wp:positionV relativeFrom="paragraph">
-              <wp:posOffset>64770</wp:posOffset>
+              <wp:posOffset>255905</wp:posOffset>
             </wp:positionV>
-            <wp:extent cx="2853252" cy="2872105"/>
-            <wp:effectExtent l="19050" t="19050" r="23495" b="23495"/>
+            <wp:extent cx="4758690" cy="3464396"/>
+            <wp:effectExtent l="19050" t="19050" r="22860" b="22225"/>
             <wp:wrapNone/>
-            <wp:docPr id="2119397423" name="Imagen 1"/>
+            <wp:docPr id="162202168" name="Imagen 1"/>
             <wp:cNvGraphicFramePr>
               <a:graphicFrameLocks xmlns:a="http://schemas.openxmlformats.org/drawingml/2006/main" noChangeAspect="1"/>
             </wp:cNvGraphicFramePr>
@@ -3331,11 +4259,11 @@
               <a:graphicData uri="http://schemas.openxmlformats.org/drawingml/2006/picture">
                 <pic:pic xmlns:pic="http://schemas.openxmlformats.org/drawingml/2006/picture">
                   <pic:nvPicPr>
-                    <pic:cNvPr id="2119397423" name=""/>
+                    <pic:cNvPr id="162202168" name=""/>
                     <pic:cNvPicPr/>
                   </pic:nvPicPr>
                   <pic:blipFill>
-                    <a:blip r:embed="rId24">
+                    <a:blip r:embed="rId32">
                       <a:extLst>
                         <a:ext uri="{28A0092B-C50C-407E-A947-70E740481C1C}">
                           <a14:useLocalDpi xmlns:a14="http://schemas.microsoft.com/office/drawing/2010/main" val="0"/>
@@ -3349,7 +4277,7 @@
                   <pic:spPr>
                     <a:xfrm>
                       <a:off x="0" y="0"/>
-                      <a:ext cx="2854091" cy="2872950"/>
+                      <a:ext cx="4758690" cy="3464396"/>
                     </a:xfrm>
                     <a:prstGeom prst="rect">
                       <a:avLst/>
@@ -3374,21 +4302,245 @@
       </w:r>
       <w:r>
         <w:rPr>
+          <w:sz w:val="24"/>
+          <w:szCs w:val="24"/>
+        </w:rPr>
+        <w:t>In this case we choose a any target for work in the environment.</w:t>
+      </w:r>
+    </w:p>
+    <w:p>
+      <w:pPr>
+        <w:spacing w:line="360" w:lineRule="auto"/>
+        <w:jc w:val="both"/>
+        <w:rPr>
+          <w:sz w:val="24"/>
+          <w:szCs w:val="24"/>
+        </w:rPr>
+      </w:pPr>
+    </w:p>
+    <w:p>
+      <w:pPr>
+        <w:spacing w:line="360" w:lineRule="auto"/>
+        <w:jc w:val="both"/>
+        <w:rPr>
+          <w:sz w:val="24"/>
+          <w:szCs w:val="24"/>
+        </w:rPr>
+      </w:pPr>
+    </w:p>
+    <w:p>
+      <w:pPr>
+        <w:spacing w:line="360" w:lineRule="auto"/>
+        <w:jc w:val="both"/>
+        <w:rPr>
+          <w:sz w:val="24"/>
+          <w:szCs w:val="24"/>
+        </w:rPr>
+      </w:pPr>
+    </w:p>
+    <w:p/>
+    <w:p/>
+    <w:p/>
+    <w:p>
+      <w:pPr>
+        <w:tabs>
+          <w:tab w:val="left" w:pos="5700"/>
+        </w:tabs>
+      </w:pPr>
+    </w:p>
+    <w:p>
+      <w:pPr>
+        <w:tabs>
+          <w:tab w:val="left" w:pos="5700"/>
+        </w:tabs>
+      </w:pPr>
+    </w:p>
+    <w:p>
+      <w:pPr>
+        <w:tabs>
+          <w:tab w:val="left" w:pos="5700"/>
+        </w:tabs>
+      </w:pPr>
+    </w:p>
+    <w:p>
+      <w:pPr>
+        <w:tabs>
+          <w:tab w:val="left" w:pos="5700"/>
+        </w:tabs>
+      </w:pPr>
+    </w:p>
+    <w:p>
+      <w:pPr>
+        <w:pStyle w:val="Descripcin"/>
+        <w:jc w:val="center"/>
+        <w:rPr>
+          <w:b/>
+          <w:bCs/>
+          <w:color w:val="002060"/>
+        </w:rPr>
+      </w:pPr>
+    </w:p>
+    <w:p>
+      <w:pPr>
+        <w:pStyle w:val="Descripcin"/>
+        <w:jc w:val="center"/>
+        <w:rPr>
+          <w:b/>
+          <w:bCs/>
+          <w:color w:val="002060"/>
+        </w:rPr>
+      </w:pPr>
+      <w:r>
+        <w:rPr>
+          <w:b/>
+          <w:bCs/>
+          <w:color w:val="002060"/>
+        </w:rPr>
+        <w:t xml:space="preserve">Figure: </w:t>
+      </w:r>
+      <w:r>
+        <w:rPr>
+          <w:b/>
+          <w:bCs/>
+          <w:color w:val="002060"/>
+        </w:rPr>
+        <w:fldChar w:fldCharType="begin"/>
+      </w:r>
+      <w:r>
+        <w:rPr>
+          <w:b/>
+          <w:bCs/>
+          <w:color w:val="002060"/>
+        </w:rPr>
+        <w:instrText xml:space="preserve"> SEQ Figure: \* ARABIC </w:instrText>
+      </w:r>
+      <w:r>
+        <w:rPr>
+          <w:b/>
+          <w:bCs/>
+          <w:color w:val="002060"/>
+        </w:rPr>
+        <w:fldChar w:fldCharType="separate"/>
+      </w:r>
+      <w:r>
+        <w:rPr>
+          <w:b/>
+          <w:bCs/>
           <w:noProof/>
+          <w:color w:val="002060"/>
+        </w:rPr>
+        <w:t>10</w:t>
+      </w:r>
+      <w:r>
+        <w:rPr>
+          <w:b/>
+          <w:bCs/>
+          <w:color w:val="002060"/>
+        </w:rPr>
+        <w:fldChar w:fldCharType="end"/>
+      </w:r>
+      <w:r>
+        <w:rPr>
+          <w:b/>
+          <w:bCs/>
+          <w:color w:val="002060"/>
+        </w:rPr>
+        <w:t xml:space="preserve"> Vivado Board Selection</w:t>
+      </w:r>
+    </w:p>
+    <w:p>
+      <w:pPr>
+        <w:tabs>
+          <w:tab w:val="left" w:pos="5700"/>
+        </w:tabs>
+        <w:spacing w:line="360" w:lineRule="auto"/>
+        <w:jc w:val="both"/>
+        <w:rPr>
+          <w:sz w:val="24"/>
+          <w:szCs w:val="24"/>
+        </w:rPr>
+      </w:pPr>
+      <w:r>
+        <w:rPr>
+          <w:sz w:val="24"/>
+          <w:szCs w:val="24"/>
+        </w:rPr>
+        <w:t xml:space="preserve">After load the project to Vivado we ser the </w:t>
+      </w:r>
+      <w:r>
+        <w:rPr>
+          <w:b/>
+          <w:bCs/>
+          <w:sz w:val="24"/>
+          <w:szCs w:val="24"/>
+        </w:rPr>
+        <w:t>“assertions”</w:t>
+      </w:r>
+      <w:r>
+        <w:rPr>
+          <w:sz w:val="24"/>
+          <w:szCs w:val="24"/>
+        </w:rPr>
+        <w:t xml:space="preserve"> for validate diffe</w:t>
+      </w:r>
+      <w:r>
+        <w:rPr>
+          <w:sz w:val="24"/>
+          <w:szCs w:val="24"/>
+        </w:rPr>
+        <w:t>rent</w:t>
+      </w:r>
+      <w:r>
+        <w:rPr>
+          <w:sz w:val="24"/>
+          <w:szCs w:val="24"/>
+        </w:rPr>
+        <w:t xml:space="preserve"> states and conditionals </w:t>
+      </w:r>
+      <w:r>
+        <w:rPr>
+          <w:sz w:val="24"/>
+          <w:szCs w:val="24"/>
+        </w:rPr>
+        <w:t>fo</w:t>
+      </w:r>
+      <w:r>
+        <w:rPr>
+          <w:sz w:val="24"/>
+          <w:szCs w:val="24"/>
+        </w:rPr>
+        <w:t>r obtain.</w:t>
+      </w:r>
+    </w:p>
+    <w:p>
+      <w:pPr>
+        <w:tabs>
+          <w:tab w:val="left" w:pos="5700"/>
+        </w:tabs>
+        <w:spacing w:line="360" w:lineRule="auto"/>
+        <w:jc w:val="both"/>
+        <w:rPr>
+          <w:sz w:val="24"/>
+          <w:szCs w:val="24"/>
+        </w:rPr>
+      </w:pPr>
+      <w:r>
+        <w:rPr>
+          <w:noProof/>
         </w:rPr>
         <w:drawing>
-          <wp:anchor distT="0" distB="0" distL="114300" distR="114300" simplePos="0" relativeHeight="251765760" behindDoc="0" locked="0" layoutInCell="1" allowOverlap="1" wp14:anchorId="3214311E" wp14:editId="3A0BE21E">
+          <wp:anchor distT="0" distB="0" distL="114300" distR="114300" simplePos="0" relativeHeight="251803648" behindDoc="0" locked="0" layoutInCell="1" allowOverlap="1" wp14:anchorId="3868FCF1" wp14:editId="1D309392">
             <wp:simplePos x="0" y="0"/>
             <wp:positionH relativeFrom="margin">
-              <wp:align>left</wp:align>
+              <wp:posOffset>2979420</wp:posOffset>
             </wp:positionH>
             <wp:positionV relativeFrom="paragraph">
-              <wp:posOffset>60960</wp:posOffset>
+              <wp:posOffset>17780</wp:posOffset>
             </wp:positionV>
-            <wp:extent cx="2772094" cy="2876550"/>
-            <wp:effectExtent l="19050" t="19050" r="28575" b="19050"/>
+            <wp:extent cx="3512820" cy="2705100"/>
+            <wp:effectExtent l="0" t="0" r="0" b="0"/>
             <wp:wrapNone/>
-            <wp:docPr id="1559668500" name="Imagen 1"/>
+            <wp:docPr id="1673141487" name="Imagen 1"/>
             <wp:cNvGraphicFramePr>
               <a:graphicFrameLocks xmlns:a="http://schemas.openxmlformats.org/drawingml/2006/main" noChangeAspect="1"/>
             </wp:cNvGraphicFramePr>
@@ -3396,730 +4548,26 @@
               <a:graphicData uri="http://schemas.openxmlformats.org/drawingml/2006/picture">
                 <pic:pic xmlns:pic="http://schemas.openxmlformats.org/drawingml/2006/picture">
                   <pic:nvPicPr>
-                    <pic:cNvPr id="1559668500" name=""/>
+                    <pic:cNvPr id="1615771062" name=""/>
                     <pic:cNvPicPr/>
                   </pic:nvPicPr>
-                  <pic:blipFill>
-                    <a:blip r:embed="rId25">
+                  <pic:blipFill rotWithShape="1">
+                    <a:blip r:embed="rId33">
                       <a:extLst>
                         <a:ext uri="{28A0092B-C50C-407E-A947-70E740481C1C}">
                           <a14:useLocalDpi xmlns:a14="http://schemas.microsoft.com/office/drawing/2010/main" val="0"/>
                         </a:ext>
                       </a:extLst>
                     </a:blip>
+                    <a:srcRect t="49439" r="5150"/>
                     <a:stretch>
                       <a:fillRect/>
                     </a:stretch>
                   </pic:blipFill>
-                  <pic:spPr>
-                    <a:xfrm>
-                      <a:off x="0" y="0"/>
-                      <a:ext cx="2772094" cy="2876550"/>
-                    </a:xfrm>
-                    <a:prstGeom prst="rect">
-                      <a:avLst/>
-                    </a:prstGeom>
-                    <a:ln>
-                      <a:solidFill>
-                        <a:schemeClr val="tx1"/>
-                      </a:solidFill>
-                    </a:ln>
-                  </pic:spPr>
-                </pic:pic>
-              </a:graphicData>
-            </a:graphic>
-            <wp14:sizeRelH relativeFrom="page">
-              <wp14:pctWidth>0</wp14:pctWidth>
-            </wp14:sizeRelH>
-            <wp14:sizeRelV relativeFrom="page">
-              <wp14:pctHeight>0</wp14:pctHeight>
-            </wp14:sizeRelV>
-          </wp:anchor>
-        </w:drawing>
-      </w:r>
-    </w:p>
-    <w:p>
-      <w:pPr>
-        <w:rPr>
-          <w:b/>
-          <w:bCs/>
-          <w:i/>
-          <w:iCs/>
-          <w:sz w:val="24"/>
-          <w:szCs w:val="24"/>
-        </w:rPr>
-      </w:pPr>
-      <w:r>
-        <w:rPr>
-          <w:b/>
-          <w:bCs/>
-          <w:i/>
-          <w:iCs/>
-          <w:sz w:val="24"/>
-          <w:szCs w:val="24"/>
-        </w:rPr>
-        <w:t xml:space="preserve"> </w:t>
-      </w:r>
-    </w:p>
-    <w:p>
-      <w:pPr>
-        <w:tabs>
-          <w:tab w:val="left" w:pos="6192"/>
-        </w:tabs>
-        <w:rPr>
-          <w:b/>
-          <w:bCs/>
-          <w:i/>
-          <w:iCs/>
-          <w:sz w:val="24"/>
-          <w:szCs w:val="24"/>
-        </w:rPr>
-      </w:pPr>
-      <w:r>
-        <w:rPr>
-          <w:b/>
-          <w:bCs/>
-          <w:i/>
-          <w:iCs/>
-          <w:sz w:val="24"/>
-          <w:szCs w:val="24"/>
-        </w:rPr>
-        <w:tab/>
-      </w:r>
-    </w:p>
-    <w:p>
-      <w:pPr>
-        <w:rPr>
-          <w:b/>
-          <w:bCs/>
-          <w:i/>
-          <w:iCs/>
-          <w:sz w:val="24"/>
-          <w:szCs w:val="24"/>
-        </w:rPr>
-      </w:pPr>
-    </w:p>
-    <w:p>
-      <w:pPr>
-        <w:rPr>
-          <w:b/>
-          <w:bCs/>
-          <w:i/>
-          <w:iCs/>
-          <w:sz w:val="24"/>
-          <w:szCs w:val="24"/>
-        </w:rPr>
-      </w:pPr>
-    </w:p>
-    <w:p>
-      <w:pPr>
-        <w:rPr>
-          <w:b/>
-          <w:bCs/>
-          <w:i/>
-          <w:iCs/>
-          <w:sz w:val="24"/>
-          <w:szCs w:val="24"/>
-        </w:rPr>
-      </w:pPr>
-    </w:p>
-    <w:p>
-      <w:pPr>
-        <w:rPr>
-          <w:sz w:val="24"/>
-          <w:szCs w:val="24"/>
-        </w:rPr>
-      </w:pPr>
-    </w:p>
-    <w:p/>
-    <w:p/>
-    <w:p>
-      <w:pPr>
-        <w:rPr>
-          <w:b/>
-          <w:bCs/>
-        </w:rPr>
-      </w:pPr>
-    </w:p>
-    <w:p>
-      <w:pPr>
-        <w:pStyle w:val="Descripcin"/>
-        <w:jc w:val="center"/>
-        <w:rPr>
-          <w:b/>
-          <w:bCs/>
-          <w:color w:val="2F5496" w:themeColor="accent1" w:themeShade="BF"/>
-        </w:rPr>
-      </w:pPr>
-    </w:p>
-    <w:p>
-      <w:pPr>
-        <w:pStyle w:val="Descripcin"/>
-        <w:jc w:val="center"/>
-        <w:rPr>
-          <w:b/>
-          <w:bCs/>
-          <w:color w:val="2F5496" w:themeColor="accent1" w:themeShade="BF"/>
-        </w:rPr>
-      </w:pPr>
-      <w:r>
-        <w:rPr>
-          <w:b/>
-          <w:bCs/>
-          <w:color w:val="2F5496" w:themeColor="accent1" w:themeShade="BF"/>
-        </w:rPr>
-        <w:t xml:space="preserve">Figure: </w:t>
-      </w:r>
-      <w:r>
-        <w:rPr>
-          <w:b/>
-          <w:bCs/>
-          <w:color w:val="2F5496" w:themeColor="accent1" w:themeShade="BF"/>
-        </w:rPr>
-        <w:fldChar w:fldCharType="begin"/>
-      </w:r>
-      <w:r>
-        <w:rPr>
-          <w:b/>
-          <w:bCs/>
-          <w:color w:val="2F5496" w:themeColor="accent1" w:themeShade="BF"/>
-        </w:rPr>
-        <w:instrText xml:space="preserve"> SEQ Figure: \* ARABIC </w:instrText>
-      </w:r>
-      <w:r>
-        <w:rPr>
-          <w:b/>
-          <w:bCs/>
-          <w:color w:val="2F5496" w:themeColor="accent1" w:themeShade="BF"/>
-        </w:rPr>
-        <w:fldChar w:fldCharType="separate"/>
-      </w:r>
-      <w:r>
-        <w:rPr>
-          <w:b/>
-          <w:bCs/>
-          <w:noProof/>
-          <w:color w:val="2F5496" w:themeColor="accent1" w:themeShade="BF"/>
-        </w:rPr>
-        <w:t>9</w:t>
-      </w:r>
-      <w:r>
-        <w:rPr>
-          <w:b/>
-          <w:bCs/>
-          <w:color w:val="2F5496" w:themeColor="accent1" w:themeShade="BF"/>
-        </w:rPr>
-        <w:fldChar w:fldCharType="end"/>
-      </w:r>
-      <w:r>
-        <w:rPr>
-          <w:b/>
-          <w:bCs/>
-          <w:color w:val="2F5496" w:themeColor="accent1" w:themeShade="BF"/>
-        </w:rPr>
-        <w:t xml:space="preserve"> PinPlanner</w:t>
-      </w:r>
-    </w:p>
-    <w:p>
-      <w:pPr>
-        <w:spacing w:line="276" w:lineRule="auto"/>
-        <w:jc w:val="both"/>
-        <w:rPr>
-          <w:sz w:val="24"/>
-          <w:szCs w:val="24"/>
-        </w:rPr>
-      </w:pPr>
-      <w:r>
-        <w:rPr>
-          <w:sz w:val="24"/>
-          <w:szCs w:val="24"/>
-        </w:rPr>
-        <w:t>The RTL view can be observed as follows.</w:t>
-      </w:r>
-    </w:p>
-    <w:p>
-      <w:pPr>
-        <w:spacing w:line="276" w:lineRule="auto"/>
-        <w:jc w:val="both"/>
-        <w:rPr>
-          <w:sz w:val="24"/>
-          <w:szCs w:val="24"/>
-        </w:rPr>
-      </w:pPr>
-      <w:r>
-        <w:rPr>
-          <w:noProof/>
-        </w:rPr>
-        <w:drawing>
-          <wp:anchor distT="0" distB="0" distL="114300" distR="114300" simplePos="0" relativeHeight="251767808" behindDoc="0" locked="0" layoutInCell="1" allowOverlap="1" wp14:anchorId="6A8C8844" wp14:editId="0DE8A024">
-            <wp:simplePos x="0" y="0"/>
-            <wp:positionH relativeFrom="margin">
-              <wp:align>center</wp:align>
-            </wp:positionH>
-            <wp:positionV relativeFrom="paragraph">
-              <wp:posOffset>281305</wp:posOffset>
-            </wp:positionV>
-            <wp:extent cx="6496637" cy="2655570"/>
-            <wp:effectExtent l="19050" t="19050" r="19050" b="11430"/>
-            <wp:wrapNone/>
-            <wp:docPr id="1256949603" name="Imagen 1"/>
-            <wp:cNvGraphicFramePr>
-              <a:graphicFrameLocks xmlns:a="http://schemas.openxmlformats.org/drawingml/2006/main" noChangeAspect="1"/>
-            </wp:cNvGraphicFramePr>
-            <a:graphic xmlns:a="http://schemas.openxmlformats.org/drawingml/2006/main">
-              <a:graphicData uri="http://schemas.openxmlformats.org/drawingml/2006/picture">
-                <pic:pic xmlns:pic="http://schemas.openxmlformats.org/drawingml/2006/picture">
-                  <pic:nvPicPr>
-                    <pic:cNvPr id="1256949603" name=""/>
-                    <pic:cNvPicPr/>
-                  </pic:nvPicPr>
-                  <pic:blipFill>
-                    <a:blip r:embed="rId26" cstate="print">
-                      <a:extLst>
-                        <a:ext uri="{28A0092B-C50C-407E-A947-70E740481C1C}">
-                          <a14:useLocalDpi xmlns:a14="http://schemas.microsoft.com/office/drawing/2010/main" val="0"/>
-                        </a:ext>
-                      </a:extLst>
-                    </a:blip>
-                    <a:stretch>
-                      <a:fillRect/>
-                    </a:stretch>
-                  </pic:blipFill>
-                  <pic:spPr>
-                    <a:xfrm>
-                      <a:off x="0" y="0"/>
-                      <a:ext cx="6496637" cy="2655570"/>
-                    </a:xfrm>
-                    <a:prstGeom prst="rect">
-                      <a:avLst/>
-                    </a:prstGeom>
-                    <a:ln>
-                      <a:solidFill>
-                        <a:schemeClr val="tx1"/>
-                      </a:solidFill>
-                    </a:ln>
-                  </pic:spPr>
-                </pic:pic>
-              </a:graphicData>
-            </a:graphic>
-            <wp14:sizeRelH relativeFrom="page">
-              <wp14:pctWidth>0</wp14:pctWidth>
-            </wp14:sizeRelH>
-            <wp14:sizeRelV relativeFrom="page">
-              <wp14:pctHeight>0</wp14:pctHeight>
-            </wp14:sizeRelV>
-          </wp:anchor>
-        </w:drawing>
-      </w:r>
-    </w:p>
-    <w:p>
-      <w:pPr>
-        <w:spacing w:line="276" w:lineRule="auto"/>
-        <w:jc w:val="both"/>
-        <w:rPr>
-          <w:sz w:val="24"/>
-          <w:szCs w:val="24"/>
-        </w:rPr>
-      </w:pPr>
-    </w:p>
-    <w:p>
-      <w:pPr>
-        <w:spacing w:line="276" w:lineRule="auto"/>
-        <w:jc w:val="both"/>
-        <w:rPr>
-          <w:sz w:val="24"/>
-          <w:szCs w:val="24"/>
-        </w:rPr>
-      </w:pPr>
-    </w:p>
-    <w:p>
-      <w:pPr>
-        <w:spacing w:line="276" w:lineRule="auto"/>
-        <w:jc w:val="both"/>
-        <w:rPr>
-          <w:sz w:val="24"/>
-          <w:szCs w:val="24"/>
-        </w:rPr>
-      </w:pPr>
-    </w:p>
-    <w:p>
-      <w:pPr>
-        <w:spacing w:line="276" w:lineRule="auto"/>
-        <w:jc w:val="both"/>
-        <w:rPr>
-          <w:sz w:val="24"/>
-          <w:szCs w:val="24"/>
-        </w:rPr>
-      </w:pPr>
-    </w:p>
-    <w:p>
-      <w:pPr>
-        <w:spacing w:line="276" w:lineRule="auto"/>
-        <w:jc w:val="both"/>
-        <w:rPr>
-          <w:sz w:val="24"/>
-          <w:szCs w:val="24"/>
-        </w:rPr>
-      </w:pPr>
-    </w:p>
-    <w:p/>
-    <w:p/>
-    <w:p/>
-    <w:p/>
-    <w:p>
-      <w:pPr>
-        <w:pStyle w:val="Descripcin"/>
-        <w:jc w:val="center"/>
-        <w:rPr>
-          <w:b/>
-          <w:bCs/>
-          <w:color w:val="2F5496" w:themeColor="accent1" w:themeShade="BF"/>
-        </w:rPr>
-      </w:pPr>
-    </w:p>
-    <w:p>
-      <w:pPr>
-        <w:pStyle w:val="Descripcin"/>
-        <w:jc w:val="center"/>
-        <w:rPr>
-          <w:b/>
-          <w:bCs/>
-          <w:color w:val="2F5496" w:themeColor="accent1" w:themeShade="BF"/>
-        </w:rPr>
-      </w:pPr>
-      <w:r>
-        <w:rPr>
-          <w:b/>
-          <w:bCs/>
-          <w:color w:val="2F5496" w:themeColor="accent1" w:themeShade="BF"/>
-        </w:rPr>
-        <w:t xml:space="preserve">Figure: </w:t>
-      </w:r>
-      <w:r>
-        <w:rPr>
-          <w:b/>
-          <w:bCs/>
-          <w:color w:val="2F5496" w:themeColor="accent1" w:themeShade="BF"/>
-        </w:rPr>
-        <w:fldChar w:fldCharType="begin"/>
-      </w:r>
-      <w:r>
-        <w:rPr>
-          <w:b/>
-          <w:bCs/>
-          <w:color w:val="2F5496" w:themeColor="accent1" w:themeShade="BF"/>
-        </w:rPr>
-        <w:instrText xml:space="preserve"> SEQ Figure: \* ARABIC </w:instrText>
-      </w:r>
-      <w:r>
-        <w:rPr>
-          <w:b/>
-          <w:bCs/>
-          <w:color w:val="2F5496" w:themeColor="accent1" w:themeShade="BF"/>
-        </w:rPr>
-        <w:fldChar w:fldCharType="separate"/>
-      </w:r>
-      <w:r>
-        <w:rPr>
-          <w:b/>
-          <w:bCs/>
-          <w:noProof/>
-          <w:color w:val="2F5496" w:themeColor="accent1" w:themeShade="BF"/>
-        </w:rPr>
-        <w:t>10</w:t>
-      </w:r>
-      <w:r>
-        <w:rPr>
-          <w:b/>
-          <w:bCs/>
-          <w:color w:val="2F5496" w:themeColor="accent1" w:themeShade="BF"/>
-        </w:rPr>
-        <w:fldChar w:fldCharType="end"/>
-      </w:r>
-      <w:r>
-        <w:rPr>
-          <w:b/>
-          <w:bCs/>
-          <w:color w:val="2F5496" w:themeColor="accent1" w:themeShade="BF"/>
-        </w:rPr>
-        <w:t xml:space="preserve"> RTL Viewer</w:t>
-      </w:r>
-    </w:p>
-    <w:p>
-      <w:pPr>
-        <w:pStyle w:val="Ttulo1"/>
-        <w:spacing w:line="276" w:lineRule="auto"/>
-        <w:rPr>
-          <w:b/>
-          <w:bCs/>
-        </w:rPr>
-      </w:pPr>
-      <w:r>
-        <w:rPr>
-          <w:b/>
-          <w:bCs/>
-        </w:rPr>
-        <w:t xml:space="preserve">FPGA Results </w:t>
-      </w:r>
-    </w:p>
-    <w:p>
-      <w:pPr>
-        <w:spacing w:line="360" w:lineRule="auto"/>
-        <w:jc w:val="both"/>
-        <w:rPr>
-          <w:b/>
-          <w:bCs/>
-          <w:i/>
-          <w:iCs/>
-          <w:sz w:val="24"/>
-          <w:szCs w:val="24"/>
-        </w:rPr>
-      </w:pPr>
-      <w:r>
-        <w:rPr>
-          <w:sz w:val="24"/>
-          <w:szCs w:val="24"/>
-        </w:rPr>
-        <w:t>To perform</w:t>
-      </w:r>
-      <w:r>
-        <w:rPr>
-          <w:sz w:val="24"/>
-          <w:szCs w:val="24"/>
-        </w:rPr>
-        <w:t xml:space="preserve"> this </w:t>
-      </w:r>
-      <w:proofErr w:type="gramStart"/>
-      <w:r>
-        <w:rPr>
-          <w:sz w:val="24"/>
-          <w:szCs w:val="24"/>
-        </w:rPr>
-        <w:t>FPGA</w:t>
-      </w:r>
-      <w:proofErr w:type="gramEnd"/>
-      <w:r>
-        <w:rPr>
-          <w:sz w:val="24"/>
-          <w:szCs w:val="24"/>
-        </w:rPr>
-        <w:t xml:space="preserve"> we can simulate </w:t>
-      </w:r>
-      <w:proofErr w:type="gramStart"/>
-      <w:r>
-        <w:rPr>
-          <w:sz w:val="24"/>
-          <w:szCs w:val="24"/>
-        </w:rPr>
-        <w:t>a 3 buys</w:t>
-      </w:r>
-      <w:proofErr w:type="gramEnd"/>
-      <w:r>
-        <w:rPr>
-          <w:sz w:val="24"/>
-          <w:szCs w:val="24"/>
-        </w:rPr>
-        <w:t xml:space="preserve"> in each one we set a $9 credit value and continue shopping the products until we have a credit that is not enough for buy other product, with this we can observe that the functionality is correct the LEDG8 represent the motor in state on because the machine continues dispenser the products and continues with </w:t>
-      </w:r>
-      <w:proofErr w:type="gramStart"/>
-      <w:r>
-        <w:rPr>
-          <w:sz w:val="24"/>
-          <w:szCs w:val="24"/>
-        </w:rPr>
-        <w:t>a</w:t>
-      </w:r>
-      <w:proofErr w:type="gramEnd"/>
-      <w:r>
-        <w:rPr>
-          <w:sz w:val="24"/>
-          <w:szCs w:val="24"/>
-        </w:rPr>
-        <w:t xml:space="preserve"> enough value for other product.</w:t>
-      </w:r>
-    </w:p>
-    <w:p>
-      <w:pPr>
-        <w:rPr>
-          <w:b/>
-          <w:bCs/>
-          <w:i/>
-          <w:iCs/>
-          <w:sz w:val="24"/>
-          <w:szCs w:val="24"/>
-          <w:u w:val="single"/>
-        </w:rPr>
-      </w:pPr>
-      <w:r>
-        <w:rPr>
-          <w:b/>
-          <w:bCs/>
-          <w:i/>
-          <w:iCs/>
-          <w:color w:val="1F3864" w:themeColor="accent1" w:themeShade="80"/>
-          <w:sz w:val="24"/>
-          <w:szCs w:val="24"/>
-          <w:u w:val="single"/>
-        </w:rPr>
-        <w:t xml:space="preserve">1.- </w:t>
-      </w:r>
-      <w:r>
-        <w:rPr>
-          <w:b/>
-          <w:bCs/>
-          <w:i/>
-          <w:iCs/>
-          <w:color w:val="1F3864" w:themeColor="accent1" w:themeShade="80"/>
-          <w:sz w:val="24"/>
-          <w:szCs w:val="24"/>
-          <w:u w:val="single"/>
-        </w:rPr>
-        <w:t>Product = $</w:t>
-      </w:r>
-      <w:proofErr w:type="gramStart"/>
-      <w:r>
-        <w:rPr>
-          <w:b/>
-          <w:bCs/>
-          <w:i/>
-          <w:iCs/>
-          <w:color w:val="1F3864" w:themeColor="accent1" w:themeShade="80"/>
-          <w:sz w:val="24"/>
-          <w:szCs w:val="24"/>
-          <w:u w:val="single"/>
-        </w:rPr>
-        <w:t>4 ,</w:t>
-      </w:r>
-      <w:proofErr w:type="gramEnd"/>
-      <w:r>
-        <w:rPr>
-          <w:b/>
-          <w:bCs/>
-          <w:i/>
-          <w:iCs/>
-          <w:color w:val="1F3864" w:themeColor="accent1" w:themeShade="80"/>
-          <w:sz w:val="24"/>
-          <w:szCs w:val="24"/>
-          <w:u w:val="single"/>
-        </w:rPr>
-        <w:t xml:space="preserve"> Credit $</w:t>
-      </w:r>
-      <w:proofErr w:type="gramStart"/>
-      <w:r>
-        <w:rPr>
-          <w:b/>
-          <w:bCs/>
-          <w:i/>
-          <w:iCs/>
-          <w:color w:val="1F3864" w:themeColor="accent1" w:themeShade="80"/>
-          <w:sz w:val="24"/>
-          <w:szCs w:val="24"/>
-          <w:u w:val="single"/>
-        </w:rPr>
-        <w:t>9 ,</w:t>
-      </w:r>
-      <w:proofErr w:type="gramEnd"/>
-      <w:r>
-        <w:rPr>
-          <w:b/>
-          <w:bCs/>
-          <w:i/>
-          <w:iCs/>
-          <w:color w:val="1F3864" w:themeColor="accent1" w:themeShade="80"/>
-          <w:sz w:val="24"/>
-          <w:szCs w:val="24"/>
-          <w:u w:val="single"/>
-        </w:rPr>
-        <w:t xml:space="preserve"> Change = $5 </w:t>
-      </w:r>
-      <w:r>
-        <w:rPr>
-          <w:b/>
-          <w:bCs/>
-          <w:i/>
-          <w:iCs/>
-          <w:color w:val="1F3864" w:themeColor="accent1" w:themeShade="80"/>
-          <w:sz w:val="24"/>
-          <w:szCs w:val="24"/>
-          <w:u w:val="single"/>
-        </w:rPr>
-        <w:sym w:font="Wingdings" w:char="F0E0"/>
-      </w:r>
-      <w:r>
-        <w:rPr>
-          <w:b/>
-          <w:bCs/>
-          <w:i/>
-          <w:iCs/>
-          <w:color w:val="1F3864" w:themeColor="accent1" w:themeShade="80"/>
-          <w:sz w:val="24"/>
-          <w:szCs w:val="24"/>
-          <w:u w:val="single"/>
-        </w:rPr>
-        <w:t xml:space="preserve">  Continuation we can continue buy other product</w:t>
-      </w:r>
-    </w:p>
-    <w:p>
-      <w:pPr>
-        <w:rPr>
-          <w:b/>
-          <w:bCs/>
-          <w:i/>
-          <w:iCs/>
-          <w:sz w:val="24"/>
-          <w:szCs w:val="24"/>
-          <w:u w:val="single"/>
-        </w:rPr>
-      </w:pPr>
-      <w:r>
-        <w:rPr>
-          <w:b/>
-          <w:bCs/>
-          <w:i/>
-          <w:iCs/>
-          <w:noProof/>
-          <w:sz w:val="24"/>
-          <w:szCs w:val="24"/>
-          <w:u w:val="single"/>
-        </w:rPr>
-        <w:drawing>
-          <wp:anchor distT="0" distB="0" distL="114300" distR="114300" simplePos="0" relativeHeight="251768832" behindDoc="0" locked="0" layoutInCell="1" allowOverlap="1" wp14:anchorId="257ABA87" wp14:editId="22681489">
-            <wp:simplePos x="0" y="0"/>
-            <wp:positionH relativeFrom="margin">
-              <wp:align>center</wp:align>
-            </wp:positionH>
-            <wp:positionV relativeFrom="paragraph">
-              <wp:posOffset>87630</wp:posOffset>
-            </wp:positionV>
-            <wp:extent cx="4457700" cy="1013531"/>
-            <wp:effectExtent l="0" t="0" r="0" b="0"/>
-            <wp:wrapNone/>
-            <wp:docPr id="1043153426" name="Imagen 3"/>
-            <wp:cNvGraphicFramePr>
-              <a:graphicFrameLocks xmlns:a="http://schemas.openxmlformats.org/drawingml/2006/main" noChangeAspect="1"/>
-            </wp:cNvGraphicFramePr>
-            <a:graphic xmlns:a="http://schemas.openxmlformats.org/drawingml/2006/main">
-              <a:graphicData uri="http://schemas.openxmlformats.org/drawingml/2006/picture">
-                <pic:pic xmlns:pic="http://schemas.openxmlformats.org/drawingml/2006/picture">
-                  <pic:nvPicPr>
-                    <pic:cNvPr id="1043153426" name="Imagen 1043153426"/>
-                    <pic:cNvPicPr/>
-                  </pic:nvPicPr>
-                  <pic:blipFill rotWithShape="1">
-                    <a:blip r:embed="rId27" cstate="print">
-                      <a:extLst>
-                        <a:ext uri="{28A0092B-C50C-407E-A947-70E740481C1C}">
-                          <a14:useLocalDpi xmlns:a14="http://schemas.microsoft.com/office/drawing/2010/main" val="0"/>
-                        </a:ext>
-                      </a:extLst>
-                    </a:blip>
-                    <a:srcRect r="2122"/>
-                    <a:stretch/>
-                  </pic:blipFill>
                   <pic:spPr bwMode="auto">
                     <a:xfrm>
                       <a:off x="0" y="0"/>
-                      <a:ext cx="4457700" cy="1013531"/>
+                      <a:ext cx="3512820" cy="2705100"/>
                     </a:xfrm>
                     <a:prstGeom prst="rect">
                       <a:avLst/>
@@ -4145,292 +4593,23 @@
           </wp:anchor>
         </w:drawing>
       </w:r>
-    </w:p>
-    <w:p>
-      <w:pPr>
-        <w:rPr>
-          <w:b/>
-          <w:bCs/>
-          <w:i/>
-          <w:iCs/>
-          <w:sz w:val="24"/>
-          <w:szCs w:val="24"/>
-          <w:u w:val="single"/>
-        </w:rPr>
-      </w:pPr>
-    </w:p>
-    <w:p>
-      <w:pPr>
-        <w:rPr>
-          <w:b/>
-          <w:bCs/>
-          <w:i/>
-          <w:iCs/>
-          <w:sz w:val="24"/>
-          <w:szCs w:val="24"/>
-          <w:u w:val="single"/>
-        </w:rPr>
-      </w:pPr>
-    </w:p>
-    <w:p>
-      <w:pPr>
-        <w:rPr>
-          <w:b/>
-          <w:bCs/>
-          <w:i/>
-          <w:iCs/>
-          <w:sz w:val="24"/>
-          <w:szCs w:val="24"/>
-          <w:u w:val="single"/>
-        </w:rPr>
-      </w:pPr>
-    </w:p>
-    <w:p>
-      <w:pPr>
-        <w:pStyle w:val="Descripcin"/>
-        <w:jc w:val="center"/>
-        <w:rPr>
-          <w:b/>
-          <w:bCs/>
-          <w:i w:val="0"/>
-          <w:iCs w:val="0"/>
-          <w:color w:val="2F5496" w:themeColor="accent1" w:themeShade="BF"/>
-          <w:sz w:val="24"/>
-          <w:szCs w:val="24"/>
-          <w:u w:val="single"/>
-        </w:rPr>
-      </w:pPr>
-      <w:r>
-        <w:rPr>
-          <w:b/>
-          <w:bCs/>
-          <w:color w:val="2F5496" w:themeColor="accent1" w:themeShade="BF"/>
-        </w:rPr>
-        <w:t xml:space="preserve">Figure: </w:t>
-      </w:r>
-      <w:r>
-        <w:rPr>
-          <w:b/>
-          <w:bCs/>
-          <w:color w:val="2F5496" w:themeColor="accent1" w:themeShade="BF"/>
-        </w:rPr>
-        <w:fldChar w:fldCharType="begin"/>
-      </w:r>
-      <w:r>
-        <w:rPr>
-          <w:b/>
-          <w:bCs/>
-          <w:color w:val="2F5496" w:themeColor="accent1" w:themeShade="BF"/>
-        </w:rPr>
-        <w:instrText xml:space="preserve"> SEQ Figure: \* ARABIC </w:instrText>
-      </w:r>
-      <w:r>
-        <w:rPr>
-          <w:b/>
-          <w:bCs/>
-          <w:color w:val="2F5496" w:themeColor="accent1" w:themeShade="BF"/>
-        </w:rPr>
-        <w:fldChar w:fldCharType="separate"/>
-      </w:r>
-      <w:r>
-        <w:rPr>
-          <w:b/>
-          <w:bCs/>
+      <w:r>
+        <w:rPr>
           <w:noProof/>
-          <w:color w:val="2F5496" w:themeColor="accent1" w:themeShade="BF"/>
-        </w:rPr>
-        <w:t>11</w:t>
-      </w:r>
-      <w:r>
-        <w:rPr>
-          <w:b/>
-          <w:bCs/>
-          <w:color w:val="2F5496" w:themeColor="accent1" w:themeShade="BF"/>
-        </w:rPr>
-        <w:fldChar w:fldCharType="end"/>
-      </w:r>
-      <w:r>
-        <w:rPr>
-          <w:b/>
-          <w:bCs/>
-          <w:color w:val="2F5496" w:themeColor="accent1" w:themeShade="BF"/>
-        </w:rPr>
-        <w:t xml:space="preserve"> Test1</w:t>
-      </w:r>
-    </w:p>
-    <w:p>
-      <w:pPr>
-        <w:rPr>
-          <w:b/>
-          <w:bCs/>
-          <w:i/>
-          <w:iCs/>
-          <w:color w:val="1F3864" w:themeColor="accent1" w:themeShade="80"/>
-          <w:sz w:val="24"/>
-          <w:szCs w:val="24"/>
-          <w:u w:val="single"/>
-        </w:rPr>
-      </w:pPr>
-      <w:r>
-        <w:rPr>
-          <w:b/>
-          <w:bCs/>
-          <w:i/>
-          <w:iCs/>
-          <w:color w:val="1F3864" w:themeColor="accent1" w:themeShade="80"/>
-          <w:sz w:val="24"/>
-          <w:szCs w:val="24"/>
-          <w:u w:val="single"/>
-        </w:rPr>
-        <w:t>2</w:t>
-      </w:r>
-      <w:r>
-        <w:rPr>
-          <w:b/>
-          <w:bCs/>
-          <w:i/>
-          <w:iCs/>
-          <w:color w:val="1F3864" w:themeColor="accent1" w:themeShade="80"/>
-          <w:sz w:val="24"/>
-          <w:szCs w:val="24"/>
-          <w:u w:val="single"/>
-        </w:rPr>
-        <w:t xml:space="preserve">.- </w:t>
-      </w:r>
-      <w:r>
-        <w:rPr>
-          <w:b/>
-          <w:bCs/>
-          <w:i/>
-          <w:iCs/>
-          <w:color w:val="1F3864" w:themeColor="accent1" w:themeShade="80"/>
-          <w:sz w:val="24"/>
-          <w:szCs w:val="24"/>
-          <w:u w:val="single"/>
-        </w:rPr>
-        <w:t>Product = $</w:t>
-      </w:r>
-      <w:proofErr w:type="gramStart"/>
-      <w:r>
-        <w:rPr>
-          <w:b/>
-          <w:bCs/>
-          <w:i/>
-          <w:iCs/>
-          <w:color w:val="1F3864" w:themeColor="accent1" w:themeShade="80"/>
-          <w:sz w:val="24"/>
-          <w:szCs w:val="24"/>
-          <w:u w:val="single"/>
-        </w:rPr>
-        <w:t>2 ,</w:t>
-      </w:r>
-      <w:proofErr w:type="gramEnd"/>
-      <w:r>
-        <w:rPr>
-          <w:b/>
-          <w:bCs/>
-          <w:i/>
-          <w:iCs/>
-          <w:color w:val="1F3864" w:themeColor="accent1" w:themeShade="80"/>
-          <w:sz w:val="24"/>
-          <w:szCs w:val="24"/>
-          <w:u w:val="single"/>
-        </w:rPr>
-        <w:t xml:space="preserve"> Credit $</w:t>
-      </w:r>
-      <w:proofErr w:type="gramStart"/>
-      <w:r>
-        <w:rPr>
-          <w:b/>
-          <w:bCs/>
-          <w:i/>
-          <w:iCs/>
-          <w:color w:val="1F3864" w:themeColor="accent1" w:themeShade="80"/>
-          <w:sz w:val="24"/>
-          <w:szCs w:val="24"/>
-          <w:u w:val="single"/>
-        </w:rPr>
-        <w:t>5 ,</w:t>
-      </w:r>
-      <w:proofErr w:type="gramEnd"/>
-      <w:r>
-        <w:rPr>
-          <w:b/>
-          <w:bCs/>
-          <w:i/>
-          <w:iCs/>
-          <w:color w:val="1F3864" w:themeColor="accent1" w:themeShade="80"/>
-          <w:sz w:val="24"/>
-          <w:szCs w:val="24"/>
-          <w:u w:val="single"/>
-        </w:rPr>
-        <w:t xml:space="preserve"> Change = $3 </w:t>
-      </w:r>
-      <w:r>
-        <w:rPr>
-          <w:b/>
-          <w:bCs/>
-          <w:i/>
-          <w:iCs/>
-          <w:color w:val="1F3864" w:themeColor="accent1" w:themeShade="80"/>
-          <w:sz w:val="24"/>
-          <w:szCs w:val="24"/>
-          <w:u w:val="single"/>
-        </w:rPr>
-        <w:sym w:font="Wingdings" w:char="F0E0"/>
-      </w:r>
-      <w:r>
-        <w:rPr>
-          <w:b/>
-          <w:bCs/>
-          <w:i/>
-          <w:iCs/>
-          <w:color w:val="1F3864" w:themeColor="accent1" w:themeShade="80"/>
-          <w:sz w:val="24"/>
-          <w:szCs w:val="24"/>
-          <w:u w:val="single"/>
-        </w:rPr>
-        <w:t xml:space="preserve">  Continuation we can continue buy other product</w:t>
-      </w:r>
-    </w:p>
-    <w:p>
-      <w:pPr>
-        <w:rPr>
-          <w:b/>
-          <w:bCs/>
-          <w:i/>
-          <w:iCs/>
-          <w:color w:val="1F3864" w:themeColor="accent1" w:themeShade="80"/>
-          <w:sz w:val="24"/>
-          <w:szCs w:val="24"/>
-          <w:u w:val="single"/>
-        </w:rPr>
-      </w:pPr>
-      <w:r>
-        <w:rPr>
-          <w:b/>
-          <w:bCs/>
-          <w:i/>
-          <w:iCs/>
-          <w:noProof/>
-          <w:color w:val="1F3864" w:themeColor="accent1" w:themeShade="80"/>
-          <w:sz w:val="24"/>
-          <w:szCs w:val="24"/>
-          <w:u w:val="single"/>
         </w:rPr>
         <w:drawing>
-          <wp:anchor distT="0" distB="0" distL="114300" distR="114300" simplePos="0" relativeHeight="251769856" behindDoc="0" locked="0" layoutInCell="1" allowOverlap="1" wp14:anchorId="07400DFE" wp14:editId="0A52B7F6">
+          <wp:anchor distT="0" distB="0" distL="114300" distR="114300" simplePos="0" relativeHeight="251801600" behindDoc="0" locked="0" layoutInCell="1" allowOverlap="1" wp14:anchorId="09D6DBE2" wp14:editId="16678A47">
             <wp:simplePos x="0" y="0"/>
-            <wp:positionH relativeFrom="margin">
-              <wp:align>center</wp:align>
+            <wp:positionH relativeFrom="column">
+              <wp:posOffset>-495300</wp:posOffset>
             </wp:positionH>
             <wp:positionV relativeFrom="paragraph">
-              <wp:posOffset>53975</wp:posOffset>
+              <wp:posOffset>48260</wp:posOffset>
             </wp:positionV>
-            <wp:extent cx="4693920" cy="1117815"/>
-            <wp:effectExtent l="0" t="0" r="0" b="6350"/>
+            <wp:extent cx="3358394" cy="2659380"/>
+            <wp:effectExtent l="0" t="0" r="0" b="7620"/>
             <wp:wrapNone/>
-            <wp:docPr id="427664399" name="Imagen 4"/>
+            <wp:docPr id="1615771062" name="Imagen 1"/>
             <wp:cNvGraphicFramePr>
               <a:graphicFrameLocks xmlns:a="http://schemas.openxmlformats.org/drawingml/2006/main" noChangeAspect="1"/>
             </wp:cNvGraphicFramePr>
@@ -4438,29 +4617,38 @@
               <a:graphicData uri="http://schemas.openxmlformats.org/drawingml/2006/picture">
                 <pic:pic xmlns:pic="http://schemas.openxmlformats.org/drawingml/2006/picture">
                   <pic:nvPicPr>
-                    <pic:cNvPr id="427664399" name="Imagen 427664399"/>
+                    <pic:cNvPr id="1615771062" name=""/>
                     <pic:cNvPicPr/>
                   </pic:nvPicPr>
-                  <pic:blipFill>
-                    <a:blip r:embed="rId28" cstate="print">
+                  <pic:blipFill rotWithShape="1">
+                    <a:blip r:embed="rId33">
                       <a:extLst>
                         <a:ext uri="{28A0092B-C50C-407E-A947-70E740481C1C}">
                           <a14:useLocalDpi xmlns:a14="http://schemas.microsoft.com/office/drawing/2010/main" val="0"/>
                         </a:ext>
                       </a:extLst>
                     </a:blip>
+                    <a:srcRect b="50714"/>
                     <a:stretch>
                       <a:fillRect/>
                     </a:stretch>
                   </pic:blipFill>
-                  <pic:spPr>
+                  <pic:spPr bwMode="auto">
                     <a:xfrm>
                       <a:off x="0" y="0"/>
-                      <a:ext cx="4693920" cy="1117815"/>
+                      <a:ext cx="3363781" cy="2663646"/>
                     </a:xfrm>
                     <a:prstGeom prst="rect">
                       <a:avLst/>
                     </a:prstGeom>
+                    <a:ln>
+                      <a:noFill/>
+                    </a:ln>
+                    <a:extLst>
+                      <a:ext uri="{53640926-AAD7-44D8-BBD7-CCE9431645EC}">
+                        <a14:shadowObscured xmlns:a14="http://schemas.microsoft.com/office/drawing/2010/main"/>
+                      </a:ext>
+                    </a:extLst>
                   </pic:spPr>
                 </pic:pic>
               </a:graphicData>
@@ -4477,32 +4665,59 @@
     </w:p>
     <w:p>
       <w:pPr>
-        <w:rPr>
-          <w:b/>
-          <w:bCs/>
-          <w:i/>
-          <w:iCs/>
-          <w:color w:val="1F3864" w:themeColor="accent1" w:themeShade="80"/>
-          <w:sz w:val="24"/>
-          <w:szCs w:val="24"/>
-          <w:u w:val="single"/>
-        </w:rPr>
-      </w:pPr>
-    </w:p>
-    <w:p>
-      <w:pPr>
-        <w:rPr>
-          <w:b/>
-          <w:bCs/>
-          <w:i/>
-          <w:iCs/>
-          <w:sz w:val="24"/>
-          <w:szCs w:val="24"/>
-          <w:u w:val="single"/>
-        </w:rPr>
-      </w:pPr>
-    </w:p>
-    <w:p/>
+        <w:tabs>
+          <w:tab w:val="left" w:pos="5700"/>
+        </w:tabs>
+        <w:spacing w:line="360" w:lineRule="auto"/>
+        <w:jc w:val="both"/>
+        <w:rPr>
+          <w:sz w:val="24"/>
+          <w:szCs w:val="24"/>
+        </w:rPr>
+      </w:pPr>
+    </w:p>
+    <w:p>
+      <w:pPr>
+        <w:tabs>
+          <w:tab w:val="left" w:pos="5700"/>
+        </w:tabs>
+      </w:pPr>
+    </w:p>
+    <w:p>
+      <w:pPr>
+        <w:tabs>
+          <w:tab w:val="left" w:pos="5700"/>
+        </w:tabs>
+      </w:pPr>
+    </w:p>
+    <w:p>
+      <w:pPr>
+        <w:tabs>
+          <w:tab w:val="left" w:pos="5700"/>
+        </w:tabs>
+      </w:pPr>
+    </w:p>
+    <w:p>
+      <w:pPr>
+        <w:tabs>
+          <w:tab w:val="left" w:pos="5700"/>
+        </w:tabs>
+      </w:pPr>
+    </w:p>
+    <w:p>
+      <w:pPr>
+        <w:tabs>
+          <w:tab w:val="left" w:pos="5700"/>
+        </w:tabs>
+      </w:pPr>
+    </w:p>
+    <w:p>
+      <w:pPr>
+        <w:tabs>
+          <w:tab w:val="left" w:pos="5700"/>
+        </w:tabs>
+      </w:pPr>
+    </w:p>
     <w:p>
       <w:pPr>
         <w:pStyle w:val="Descripcin"/>
@@ -4510,300 +4725,8 @@
         <w:rPr>
           <w:b/>
           <w:bCs/>
-        </w:rPr>
-      </w:pPr>
-      <w:r>
-        <w:rPr>
-          <w:b/>
-          <w:bCs/>
-        </w:rPr>
-        <w:t xml:space="preserve">Figure: </w:t>
-      </w:r>
-      <w:r>
-        <w:rPr>
-          <w:b/>
-          <w:bCs/>
-        </w:rPr>
-        <w:fldChar w:fldCharType="begin"/>
-      </w:r>
-      <w:r>
-        <w:rPr>
-          <w:b/>
-          <w:bCs/>
-        </w:rPr>
-        <w:instrText xml:space="preserve"> SEQ Figure: \* ARABIC </w:instrText>
-      </w:r>
-      <w:r>
-        <w:rPr>
-          <w:b/>
-          <w:bCs/>
-        </w:rPr>
-        <w:fldChar w:fldCharType="separate"/>
-      </w:r>
-      <w:r>
-        <w:rPr>
-          <w:b/>
-          <w:bCs/>
-          <w:noProof/>
-        </w:rPr>
-        <w:t>12</w:t>
-      </w:r>
-      <w:r>
-        <w:rPr>
-          <w:b/>
-          <w:bCs/>
-        </w:rPr>
-        <w:fldChar w:fldCharType="end"/>
-      </w:r>
-      <w:r>
-        <w:rPr>
-          <w:b/>
-          <w:bCs/>
-        </w:rPr>
-        <w:t xml:space="preserve"> Test2</w:t>
-      </w:r>
-    </w:p>
-    <w:p/>
-    <w:p>
-      <w:pPr>
-        <w:rPr>
-          <w:b/>
-          <w:bCs/>
-          <w:i/>
-          <w:iCs/>
-          <w:sz w:val="24"/>
-          <w:szCs w:val="24"/>
-          <w:u w:val="single"/>
-        </w:rPr>
-      </w:pPr>
-      <w:r>
-        <w:rPr>
-          <w:b/>
-          <w:bCs/>
-          <w:i/>
-          <w:iCs/>
           <w:color w:val="1F3864" w:themeColor="accent1" w:themeShade="80"/>
-          <w:sz w:val="24"/>
-          <w:szCs w:val="24"/>
-          <w:u w:val="single"/>
-        </w:rPr>
-        <w:t>3</w:t>
-      </w:r>
-      <w:r>
-        <w:rPr>
-          <w:b/>
-          <w:bCs/>
-          <w:i/>
-          <w:iCs/>
-          <w:color w:val="1F3864" w:themeColor="accent1" w:themeShade="80"/>
-          <w:sz w:val="24"/>
-          <w:szCs w:val="24"/>
-          <w:u w:val="single"/>
-        </w:rPr>
-        <w:t xml:space="preserve">.- </w:t>
-      </w:r>
-      <w:r>
-        <w:rPr>
-          <w:b/>
-          <w:bCs/>
-          <w:i/>
-          <w:iCs/>
-          <w:color w:val="1F3864" w:themeColor="accent1" w:themeShade="80"/>
-          <w:sz w:val="24"/>
-          <w:szCs w:val="24"/>
-          <w:u w:val="single"/>
-        </w:rPr>
-        <w:t>Product = $</w:t>
-      </w:r>
-      <w:proofErr w:type="gramStart"/>
-      <w:r>
-        <w:rPr>
-          <w:b/>
-          <w:bCs/>
-          <w:i/>
-          <w:iCs/>
-          <w:color w:val="1F3864" w:themeColor="accent1" w:themeShade="80"/>
-          <w:sz w:val="24"/>
-          <w:szCs w:val="24"/>
-          <w:u w:val="single"/>
-        </w:rPr>
-        <w:t>2 ,</w:t>
-      </w:r>
-      <w:proofErr w:type="gramEnd"/>
-      <w:r>
-        <w:rPr>
-          <w:b/>
-          <w:bCs/>
-          <w:i/>
-          <w:iCs/>
-          <w:color w:val="1F3864" w:themeColor="accent1" w:themeShade="80"/>
-          <w:sz w:val="24"/>
-          <w:szCs w:val="24"/>
-          <w:u w:val="single"/>
-        </w:rPr>
-        <w:t xml:space="preserve"> Credit $</w:t>
-      </w:r>
-      <w:proofErr w:type="gramStart"/>
-      <w:r>
-        <w:rPr>
-          <w:b/>
-          <w:bCs/>
-          <w:i/>
-          <w:iCs/>
-          <w:color w:val="1F3864" w:themeColor="accent1" w:themeShade="80"/>
-          <w:sz w:val="24"/>
-          <w:szCs w:val="24"/>
-          <w:u w:val="single"/>
-        </w:rPr>
-        <w:t>3 ,</w:t>
-      </w:r>
-      <w:proofErr w:type="gramEnd"/>
-      <w:r>
-        <w:rPr>
-          <w:b/>
-          <w:bCs/>
-          <w:i/>
-          <w:iCs/>
-          <w:color w:val="1F3864" w:themeColor="accent1" w:themeShade="80"/>
-          <w:sz w:val="24"/>
-          <w:szCs w:val="24"/>
-          <w:u w:val="single"/>
-        </w:rPr>
-        <w:t xml:space="preserve"> Change = $1 </w:t>
-      </w:r>
-      <w:r>
-        <w:rPr>
-          <w:b/>
-          <w:bCs/>
-          <w:i/>
-          <w:iCs/>
-          <w:color w:val="1F3864" w:themeColor="accent1" w:themeShade="80"/>
-          <w:sz w:val="24"/>
-          <w:szCs w:val="24"/>
-          <w:u w:val="single"/>
-        </w:rPr>
-        <w:sym w:font="Wingdings" w:char="F0E0"/>
-      </w:r>
-      <w:r>
-        <w:rPr>
-          <w:b/>
-          <w:bCs/>
-          <w:i/>
-          <w:iCs/>
-          <w:color w:val="1F3864" w:themeColor="accent1" w:themeShade="80"/>
-          <w:sz w:val="24"/>
-          <w:szCs w:val="24"/>
-          <w:u w:val="single"/>
-        </w:rPr>
-        <w:t xml:space="preserve">  Continuation we can continue buy other product</w:t>
-      </w:r>
-    </w:p>
-    <w:p>
-      <w:pPr>
-        <w:tabs>
-          <w:tab w:val="left" w:pos="5700"/>
-        </w:tabs>
-      </w:pPr>
-      <w:r>
-        <w:rPr>
-          <w:b/>
-          <w:bCs/>
-          <w:i/>
-          <w:iCs/>
-          <w:noProof/>
-          <w:sz w:val="24"/>
-          <w:szCs w:val="24"/>
-          <w:u w:val="single"/>
-        </w:rPr>
-        <w:drawing>
-          <wp:anchor distT="0" distB="0" distL="114300" distR="114300" simplePos="0" relativeHeight="251770880" behindDoc="0" locked="0" layoutInCell="1" allowOverlap="1" wp14:anchorId="61DD3FD4" wp14:editId="28D83AC1">
-            <wp:simplePos x="0" y="0"/>
-            <wp:positionH relativeFrom="margin">
-              <wp:align>center</wp:align>
-            </wp:positionH>
-            <wp:positionV relativeFrom="paragraph">
-              <wp:posOffset>118110</wp:posOffset>
-            </wp:positionV>
-            <wp:extent cx="4892040" cy="1174926"/>
-            <wp:effectExtent l="0" t="0" r="3810" b="6350"/>
-            <wp:wrapNone/>
-            <wp:docPr id="1528252766" name="Imagen 5"/>
-            <wp:cNvGraphicFramePr>
-              <a:graphicFrameLocks xmlns:a="http://schemas.openxmlformats.org/drawingml/2006/main" noChangeAspect="1"/>
-            </wp:cNvGraphicFramePr>
-            <a:graphic xmlns:a="http://schemas.openxmlformats.org/drawingml/2006/main">
-              <a:graphicData uri="http://schemas.openxmlformats.org/drawingml/2006/picture">
-                <pic:pic xmlns:pic="http://schemas.openxmlformats.org/drawingml/2006/picture">
-                  <pic:nvPicPr>
-                    <pic:cNvPr id="1528252766" name="Imagen 1528252766"/>
-                    <pic:cNvPicPr/>
-                  </pic:nvPicPr>
-                  <pic:blipFill>
-                    <a:blip r:embed="rId29" cstate="print">
-                      <a:extLst>
-                        <a:ext uri="{28A0092B-C50C-407E-A947-70E740481C1C}">
-                          <a14:useLocalDpi xmlns:a14="http://schemas.microsoft.com/office/drawing/2010/main" val="0"/>
-                        </a:ext>
-                      </a:extLst>
-                    </a:blip>
-                    <a:stretch>
-                      <a:fillRect/>
-                    </a:stretch>
-                  </pic:blipFill>
-                  <pic:spPr>
-                    <a:xfrm>
-                      <a:off x="0" y="0"/>
-                      <a:ext cx="4892040" cy="1174926"/>
-                    </a:xfrm>
-                    <a:prstGeom prst="rect">
-                      <a:avLst/>
-                    </a:prstGeom>
-                  </pic:spPr>
-                </pic:pic>
-              </a:graphicData>
-            </a:graphic>
-            <wp14:sizeRelH relativeFrom="page">
-              <wp14:pctWidth>0</wp14:pctWidth>
-            </wp14:sizeRelH>
-            <wp14:sizeRelV relativeFrom="page">
-              <wp14:pctHeight>0</wp14:pctHeight>
-            </wp14:sizeRelV>
-          </wp:anchor>
-        </w:drawing>
-      </w:r>
-    </w:p>
-    <w:p>
-      <w:pPr>
-        <w:tabs>
-          <w:tab w:val="left" w:pos="5700"/>
-        </w:tabs>
-      </w:pPr>
-    </w:p>
-    <w:p>
-      <w:pPr>
-        <w:tabs>
-          <w:tab w:val="left" w:pos="5700"/>
-        </w:tabs>
-      </w:pPr>
-    </w:p>
-    <w:p>
-      <w:pPr>
-        <w:rPr>
-          <w:b/>
-          <w:bCs/>
-          <w:i/>
-          <w:iCs/>
-          <w:sz w:val="24"/>
-          <w:szCs w:val="24"/>
-          <w:u w:val="single"/>
-        </w:rPr>
-      </w:pPr>
-    </w:p>
-    <w:p>
-      <w:pPr>
-        <w:tabs>
-          <w:tab w:val="left" w:pos="5700"/>
-        </w:tabs>
+        </w:rPr>
       </w:pPr>
     </w:p>
     <w:p>
@@ -4813,14 +4736,25 @@
         <w:rPr>
           <w:b/>
           <w:bCs/>
-          <w:color w:val="2F5496" w:themeColor="accent1" w:themeShade="BF"/>
-        </w:rPr>
-      </w:pPr>
-      <w:r>
-        <w:rPr>
-          <w:b/>
-          <w:bCs/>
-          <w:color w:val="2F5496" w:themeColor="accent1" w:themeShade="BF"/>
+          <w:color w:val="1F3864" w:themeColor="accent1" w:themeShade="80"/>
+        </w:rPr>
+      </w:pPr>
+    </w:p>
+    <w:p>
+      <w:pPr>
+        <w:pStyle w:val="Descripcin"/>
+        <w:jc w:val="center"/>
+        <w:rPr>
+          <w:b/>
+          <w:bCs/>
+          <w:color w:val="1F3864" w:themeColor="accent1" w:themeShade="80"/>
+        </w:rPr>
+      </w:pPr>
+      <w:r>
+        <w:rPr>
+          <w:b/>
+          <w:bCs/>
+          <w:color w:val="1F3864" w:themeColor="accent1" w:themeShade="80"/>
         </w:rPr>
         <w:t xml:space="preserve">Figure: </w:t>
       </w:r>
@@ -4828,7 +4762,7 @@
         <w:rPr>
           <w:b/>
           <w:bCs/>
-          <w:color w:val="2F5496" w:themeColor="accent1" w:themeShade="BF"/>
+          <w:color w:val="1F3864" w:themeColor="accent1" w:themeShade="80"/>
         </w:rPr>
         <w:fldChar w:fldCharType="begin"/>
       </w:r>
@@ -4836,7 +4770,7 @@
         <w:rPr>
           <w:b/>
           <w:bCs/>
-          <w:color w:val="2F5496" w:themeColor="accent1" w:themeShade="BF"/>
+          <w:color w:val="1F3864" w:themeColor="accent1" w:themeShade="80"/>
         </w:rPr>
         <w:instrText xml:space="preserve"> SEQ Figure: \* ARABIC </w:instrText>
       </w:r>
@@ -4844,7 +4778,7 @@
         <w:rPr>
           <w:b/>
           <w:bCs/>
-          <w:color w:val="2F5496" w:themeColor="accent1" w:themeShade="BF"/>
+          <w:color w:val="1F3864" w:themeColor="accent1" w:themeShade="80"/>
         </w:rPr>
         <w:fldChar w:fldCharType="separate"/>
       </w:r>
@@ -4853,15 +4787,15 @@
           <w:b/>
           <w:bCs/>
           <w:noProof/>
-          <w:color w:val="2F5496" w:themeColor="accent1" w:themeShade="BF"/>
-        </w:rPr>
-        <w:t>13</w:t>
-      </w:r>
-      <w:r>
-        <w:rPr>
-          <w:b/>
-          <w:bCs/>
-          <w:color w:val="2F5496" w:themeColor="accent1" w:themeShade="BF"/>
+          <w:color w:val="1F3864" w:themeColor="accent1" w:themeShade="80"/>
+        </w:rPr>
+        <w:t>11</w:t>
+      </w:r>
+      <w:r>
+        <w:rPr>
+          <w:b/>
+          <w:bCs/>
+          <w:color w:val="1F3864" w:themeColor="accent1" w:themeShade="80"/>
         </w:rPr>
         <w:fldChar w:fldCharType="end"/>
       </w:r>
@@ -4869,40 +4803,309 @@
         <w:rPr>
           <w:b/>
           <w:bCs/>
-          <w:color w:val="2F5496" w:themeColor="accent1" w:themeShade="BF"/>
-        </w:rPr>
-        <w:t xml:space="preserve"> Test3</w:t>
-      </w:r>
-    </w:p>
-    <w:p>
-      <w:pPr>
-        <w:tabs>
-          <w:tab w:val="left" w:pos="5700"/>
-        </w:tabs>
-      </w:pPr>
-    </w:p>
-    <w:p>
-      <w:pPr>
-        <w:tabs>
-          <w:tab w:val="left" w:pos="5700"/>
-        </w:tabs>
-      </w:pPr>
-    </w:p>
-    <w:p>
-      <w:pPr>
-        <w:tabs>
-          <w:tab w:val="left" w:pos="5700"/>
-        </w:tabs>
-      </w:pPr>
-    </w:p>
-    <w:p>
-      <w:pPr>
-        <w:tabs>
-          <w:tab w:val="left" w:pos="5700"/>
-        </w:tabs>
-      </w:pPr>
-      <w:r>
-        <w:tab/>
+          <w:color w:val="1F3864" w:themeColor="accent1" w:themeShade="80"/>
+        </w:rPr>
+        <w:t>Assertions Vivado</w:t>
+      </w:r>
+    </w:p>
+    <w:p>
+      <w:pPr>
+        <w:spacing w:line="360" w:lineRule="auto"/>
+        <w:jc w:val="both"/>
+        <w:rPr>
+          <w:sz w:val="24"/>
+          <w:szCs w:val="24"/>
+        </w:rPr>
+      </w:pPr>
+    </w:p>
+    <w:p>
+      <w:pPr>
+        <w:spacing w:line="360" w:lineRule="auto"/>
+        <w:jc w:val="both"/>
+        <w:rPr>
+          <w:sz w:val="24"/>
+          <w:szCs w:val="24"/>
+        </w:rPr>
+      </w:pPr>
+      <w:r>
+        <w:rPr>
+          <w:sz w:val="24"/>
+          <w:szCs w:val="24"/>
+        </w:rPr>
+        <w:t>In the simulation, we can observe the behavior of the assertions in the project in the following way, as well as their behavior in the waveforms.</w:t>
+      </w:r>
+    </w:p>
+    <w:p>
+      <w:pPr>
+        <w:spacing w:line="360" w:lineRule="auto"/>
+        <w:jc w:val="both"/>
+        <w:rPr>
+          <w:sz w:val="24"/>
+          <w:szCs w:val="24"/>
+        </w:rPr>
+      </w:pPr>
+      <w:r>
+        <w:rPr>
+          <w:noProof/>
+          <w:sz w:val="24"/>
+          <w:szCs w:val="24"/>
+        </w:rPr>
+        <mc:AlternateContent>
+          <mc:Choice Requires="wpg">
+            <w:drawing>
+              <wp:anchor distT="0" distB="0" distL="114300" distR="114300" simplePos="0" relativeHeight="251806720" behindDoc="0" locked="0" layoutInCell="1" allowOverlap="1" wp14:anchorId="033F5B36" wp14:editId="6B8E6FB9">
+                <wp:simplePos x="0" y="0"/>
+                <wp:positionH relativeFrom="column">
+                  <wp:posOffset>0</wp:posOffset>
+                </wp:positionH>
+                <wp:positionV relativeFrom="paragraph">
+                  <wp:posOffset>11430</wp:posOffset>
+                </wp:positionV>
+                <wp:extent cx="5943600" cy="2903220"/>
+                <wp:effectExtent l="19050" t="19050" r="19050" b="11430"/>
+                <wp:wrapNone/>
+                <wp:docPr id="140929720" name="Grupo 3"/>
+                <wp:cNvGraphicFramePr/>
+                <a:graphic xmlns:a="http://schemas.openxmlformats.org/drawingml/2006/main">
+                  <a:graphicData uri="http://schemas.microsoft.com/office/word/2010/wordprocessingGroup">
+                    <wpg:wgp>
+                      <wpg:cNvGrpSpPr/>
+                      <wpg:grpSpPr>
+                        <a:xfrm>
+                          <a:off x="0" y="0"/>
+                          <a:ext cx="5943600" cy="2903220"/>
+                          <a:chOff x="0" y="0"/>
+                          <a:chExt cx="5943600" cy="2903220"/>
+                        </a:xfrm>
+                      </wpg:grpSpPr>
+                      <pic:pic xmlns:pic="http://schemas.openxmlformats.org/drawingml/2006/picture">
+                        <pic:nvPicPr>
+                          <pic:cNvPr id="1213832259" name="Imagen 1"/>
+                          <pic:cNvPicPr>
+                            <a:picLocks noChangeAspect="1"/>
+                          </pic:cNvPicPr>
+                        </pic:nvPicPr>
+                        <pic:blipFill>
+                          <a:blip r:embed="rId34">
+                            <a:extLst>
+                              <a:ext uri="{28A0092B-C50C-407E-A947-70E740481C1C}">
+                                <a14:useLocalDpi xmlns:a14="http://schemas.microsoft.com/office/drawing/2010/main" val="0"/>
+                              </a:ext>
+                            </a:extLst>
+                          </a:blip>
+                          <a:stretch>
+                            <a:fillRect/>
+                          </a:stretch>
+                        </pic:blipFill>
+                        <pic:spPr>
+                          <a:xfrm>
+                            <a:off x="0" y="0"/>
+                            <a:ext cx="5943600" cy="1915795"/>
+                          </a:xfrm>
+                          <a:prstGeom prst="rect">
+                            <a:avLst/>
+                          </a:prstGeom>
+                          <a:ln>
+                            <a:solidFill>
+                              <a:schemeClr val="tx1"/>
+                            </a:solidFill>
+                          </a:ln>
+                        </pic:spPr>
+                      </pic:pic>
+                      <pic:pic xmlns:pic="http://schemas.openxmlformats.org/drawingml/2006/picture">
+                        <pic:nvPicPr>
+                          <pic:cNvPr id="1938540901" name="Imagen 1"/>
+                          <pic:cNvPicPr>
+                            <a:picLocks noChangeAspect="1"/>
+                          </pic:cNvPicPr>
+                        </pic:nvPicPr>
+                        <pic:blipFill>
+                          <a:blip r:embed="rId35">
+                            <a:extLst>
+                              <a:ext uri="{28A0092B-C50C-407E-A947-70E740481C1C}">
+                                <a14:useLocalDpi xmlns:a14="http://schemas.microsoft.com/office/drawing/2010/main" val="0"/>
+                              </a:ext>
+                            </a:extLst>
+                          </a:blip>
+                          <a:stretch>
+                            <a:fillRect/>
+                          </a:stretch>
+                        </pic:blipFill>
+                        <pic:spPr>
+                          <a:xfrm>
+                            <a:off x="0" y="1920240"/>
+                            <a:ext cx="5943600" cy="982980"/>
+                          </a:xfrm>
+                          <a:prstGeom prst="rect">
+                            <a:avLst/>
+                          </a:prstGeom>
+                          <a:ln>
+                            <a:solidFill>
+                              <a:schemeClr val="tx1"/>
+                            </a:solidFill>
+                          </a:ln>
+                        </pic:spPr>
+                      </pic:pic>
+                    </wpg:wgp>
+                  </a:graphicData>
+                </a:graphic>
+              </wp:anchor>
+            </w:drawing>
+          </mc:Choice>
+          <mc:Fallback>
+            <w:pict>
+              <v:group w14:anchorId="72460E91" id="Grupo 3" o:spid="_x0000_s1026" style="position:absolute;margin-left:0;margin-top:.9pt;width:468pt;height:228.6pt;z-index:251806720" coordsize="59436,29032" o:gfxdata="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">
+                <v:shape id="Imagen 1" o:spid="_x0000_s1027" type="#_x0000_t75" style="position:absolute;width:59436;height:19157;visibility:visible;mso-wrap-style:square" o:gfxdata="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" stroked="t" strokecolor="black [3213]">
+                  <v:imagedata r:id="rId36" o:title=""/>
+                  <v:path arrowok="t"/>
+                </v:shape>
+                <v:shape id="Imagen 1" o:spid="_x0000_s1028" type="#_x0000_t75" style="position:absolute;top:19202;width:59436;height:9830;visibility:visible;mso-wrap-style:square" o:gfxdata="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" stroked="t" strokecolor="black [3213]">
+                  <v:imagedata r:id="rId37" o:title=""/>
+                  <v:path arrowok="t"/>
+                </v:shape>
+              </v:group>
+            </w:pict>
+          </mc:Fallback>
+        </mc:AlternateContent>
+      </w:r>
+    </w:p>
+    <w:p>
+      <w:pPr>
+        <w:spacing w:line="360" w:lineRule="auto"/>
+        <w:jc w:val="both"/>
+        <w:rPr>
+          <w:sz w:val="24"/>
+          <w:szCs w:val="24"/>
+        </w:rPr>
+      </w:pPr>
+    </w:p>
+    <w:p>
+      <w:pPr>
+        <w:spacing w:line="360" w:lineRule="auto"/>
+        <w:jc w:val="both"/>
+        <w:rPr>
+          <w:sz w:val="24"/>
+          <w:szCs w:val="24"/>
+        </w:rPr>
+      </w:pPr>
+    </w:p>
+    <w:p>
+      <w:pPr>
+        <w:spacing w:line="360" w:lineRule="auto"/>
+        <w:jc w:val="both"/>
+        <w:rPr>
+          <w:sz w:val="24"/>
+          <w:szCs w:val="24"/>
+        </w:rPr>
+      </w:pPr>
+    </w:p>
+    <w:p>
+      <w:pPr>
+        <w:spacing w:line="360" w:lineRule="auto"/>
+        <w:jc w:val="both"/>
+        <w:rPr>
+          <w:sz w:val="24"/>
+          <w:szCs w:val="24"/>
+        </w:rPr>
+      </w:pPr>
+    </w:p>
+    <w:p/>
+    <w:p/>
+    <w:p/>
+    <w:p>
+      <w:pPr>
+        <w:jc w:val="center"/>
+        <w:rPr>
+          <w:b/>
+          <w:bCs/>
+          <w:color w:val="1F3864" w:themeColor="accent1" w:themeShade="80"/>
+        </w:rPr>
+      </w:pPr>
+    </w:p>
+    <w:p>
+      <w:pPr>
+        <w:pStyle w:val="Descripcin"/>
+        <w:jc w:val="center"/>
+        <w:rPr>
+          <w:b/>
+          <w:bCs/>
+          <w:color w:val="1F3864" w:themeColor="accent1" w:themeShade="80"/>
+        </w:rPr>
+      </w:pPr>
+      <w:r>
+        <w:rPr>
+          <w:b/>
+          <w:bCs/>
+          <w:color w:val="1F3864" w:themeColor="accent1" w:themeShade="80"/>
+        </w:rPr>
+        <w:t xml:space="preserve">Figure: </w:t>
+      </w:r>
+      <w:r>
+        <w:rPr>
+          <w:b/>
+          <w:bCs/>
+          <w:color w:val="1F3864" w:themeColor="accent1" w:themeShade="80"/>
+        </w:rPr>
+        <w:fldChar w:fldCharType="begin"/>
+      </w:r>
+      <w:r>
+        <w:rPr>
+          <w:b/>
+          <w:bCs/>
+          <w:color w:val="1F3864" w:themeColor="accent1" w:themeShade="80"/>
+        </w:rPr>
+        <w:instrText xml:space="preserve"> SEQ Figure: \* ARABIC </w:instrText>
+      </w:r>
+      <w:r>
+        <w:rPr>
+          <w:b/>
+          <w:bCs/>
+          <w:color w:val="1F3864" w:themeColor="accent1" w:themeShade="80"/>
+        </w:rPr>
+        <w:fldChar w:fldCharType="separate"/>
+      </w:r>
+      <w:r>
+        <w:rPr>
+          <w:b/>
+          <w:bCs/>
+          <w:noProof/>
+          <w:color w:val="1F3864" w:themeColor="accent1" w:themeShade="80"/>
+        </w:rPr>
+        <w:t>12</w:t>
+      </w:r>
+      <w:r>
+        <w:rPr>
+          <w:b/>
+          <w:bCs/>
+          <w:color w:val="1F3864" w:themeColor="accent1" w:themeShade="80"/>
+        </w:rPr>
+        <w:fldChar w:fldCharType="end"/>
+      </w:r>
+      <w:r>
+        <w:rPr>
+          <w:b/>
+          <w:bCs/>
+          <w:color w:val="1F3864" w:themeColor="accent1" w:themeShade="80"/>
+        </w:rPr>
+        <w:t xml:space="preserve"> Vivado Simulation</w:t>
+      </w:r>
+    </w:p>
+    <w:p/>
+    <w:p>
+      <w:pPr>
+        <w:spacing w:line="360" w:lineRule="auto"/>
+        <w:jc w:val="both"/>
+        <w:rPr>
+          <w:sz w:val="24"/>
+          <w:szCs w:val="24"/>
+        </w:rPr>
+      </w:pPr>
+      <w:r>
+        <w:rPr>
+          <w:sz w:val="24"/>
+          <w:szCs w:val="24"/>
+        </w:rPr>
+        <w:t>If in the console don’t show a “error message” the assertions passed successful the validations</w:t>
       </w:r>
     </w:p>
     <w:p>
@@ -4924,38 +5127,157 @@
     </w:p>
     <w:p>
       <w:pPr>
-        <w:jc w:val="both"/>
-        <w:rPr>
-          <w:b/>
-          <w:bCs/>
-          <w:color w:val="2F5496" w:themeColor="accent1" w:themeShade="BF"/>
+        <w:spacing w:line="360" w:lineRule="auto"/>
+        <w:jc w:val="both"/>
+        <w:rPr>
+          <w:b/>
+          <w:bCs/>
           <w:sz w:val="28"/>
           <w:szCs w:val="28"/>
         </w:rPr>
       </w:pPr>
-      <w:hyperlink r:id="rId30" w:history="1">
+      <w:hyperlink r:id="rId38" w:history="1">
         <w:r>
           <w:rPr>
             <w:rStyle w:val="Hipervnculo"/>
             <w:b/>
             <w:bCs/>
-            <w:color w:val="034990" w:themeColor="hyperlink" w:themeShade="BF"/>
             <w:sz w:val="28"/>
             <w:szCs w:val="28"/>
           </w:rPr>
-          <w:t>https://github.com/CeicGitHub/Fundamentals_Of_Digital_Design_FPGA_3/tree/Lab3_VendingMachine</w:t>
+          <w:t>https://github.com/CeicGitHub/Fundamentals_Of_Digital_Design_FPGA_4/tree/Lab1_TrafficLights</w:t>
         </w:r>
       </w:hyperlink>
     </w:p>
     <w:p>
       <w:pPr>
-        <w:jc w:val="both"/>
-        <w:rPr>
-          <w:b/>
-          <w:bCs/>
-          <w:color w:val="2F5496" w:themeColor="accent1" w:themeShade="BF"/>
-          <w:sz w:val="24"/>
-          <w:szCs w:val="24"/>
+        <w:spacing w:line="360" w:lineRule="auto"/>
+        <w:jc w:val="both"/>
+        <w:rPr>
+          <w:b/>
+          <w:bCs/>
+          <w:sz w:val="28"/>
+          <w:szCs w:val="28"/>
+        </w:rPr>
+      </w:pPr>
+    </w:p>
+    <w:p>
+      <w:pPr>
+        <w:spacing w:line="360" w:lineRule="auto"/>
+        <w:jc w:val="both"/>
+        <w:rPr>
+          <w:b/>
+          <w:bCs/>
+          <w:sz w:val="28"/>
+          <w:szCs w:val="28"/>
+        </w:rPr>
+      </w:pPr>
+    </w:p>
+    <w:p>
+      <w:pPr>
+        <w:spacing w:line="360" w:lineRule="auto"/>
+        <w:jc w:val="both"/>
+        <w:rPr>
+          <w:b/>
+          <w:bCs/>
+          <w:sz w:val="28"/>
+          <w:szCs w:val="28"/>
+        </w:rPr>
+      </w:pPr>
+    </w:p>
+    <w:p>
+      <w:pPr>
+        <w:spacing w:line="360" w:lineRule="auto"/>
+        <w:jc w:val="both"/>
+        <w:rPr>
+          <w:b/>
+          <w:bCs/>
+          <w:sz w:val="28"/>
+          <w:szCs w:val="28"/>
+        </w:rPr>
+      </w:pPr>
+    </w:p>
+    <w:p>
+      <w:pPr>
+        <w:spacing w:line="360" w:lineRule="auto"/>
+        <w:jc w:val="both"/>
+        <w:rPr>
+          <w:b/>
+          <w:bCs/>
+          <w:sz w:val="28"/>
+          <w:szCs w:val="28"/>
+        </w:rPr>
+      </w:pPr>
+    </w:p>
+    <w:p>
+      <w:pPr>
+        <w:spacing w:line="360" w:lineRule="auto"/>
+        <w:jc w:val="both"/>
+        <w:rPr>
+          <w:b/>
+          <w:bCs/>
+          <w:sz w:val="28"/>
+          <w:szCs w:val="28"/>
+        </w:rPr>
+      </w:pPr>
+    </w:p>
+    <w:p>
+      <w:pPr>
+        <w:spacing w:line="360" w:lineRule="auto"/>
+        <w:jc w:val="both"/>
+        <w:rPr>
+          <w:b/>
+          <w:bCs/>
+          <w:sz w:val="28"/>
+          <w:szCs w:val="28"/>
+        </w:rPr>
+      </w:pPr>
+    </w:p>
+    <w:p>
+      <w:pPr>
+        <w:spacing w:line="360" w:lineRule="auto"/>
+        <w:jc w:val="both"/>
+        <w:rPr>
+          <w:b/>
+          <w:bCs/>
+          <w:sz w:val="28"/>
+          <w:szCs w:val="28"/>
+        </w:rPr>
+      </w:pPr>
+    </w:p>
+    <w:p>
+      <w:pPr>
+        <w:spacing w:line="360" w:lineRule="auto"/>
+        <w:jc w:val="both"/>
+        <w:rPr>
+          <w:b/>
+          <w:bCs/>
+          <w:sz w:val="28"/>
+          <w:szCs w:val="28"/>
+        </w:rPr>
+      </w:pPr>
+    </w:p>
+    <w:p>
+      <w:pPr>
+        <w:spacing w:line="360" w:lineRule="auto"/>
+        <w:jc w:val="both"/>
+        <w:rPr>
+          <w:b/>
+          <w:bCs/>
+          <w:sz w:val="28"/>
+          <w:szCs w:val="28"/>
+        </w:rPr>
+      </w:pPr>
+    </w:p>
+    <w:p>
+      <w:pPr>
+        <w:spacing w:line="360" w:lineRule="auto"/>
+        <w:jc w:val="both"/>
+        <w:rPr>
+          <w:b/>
+          <w:bCs/>
+          <w:sz w:val="28"/>
+          <w:szCs w:val="28"/>
         </w:rPr>
       </w:pPr>
     </w:p>
@@ -5065,7 +5387,6 @@
           <w:sz w:val="24"/>
           <w:szCs w:val="24"/>
         </w:rPr>
-        <w:lastRenderedPageBreak/>
         <w:t>We had to segment much of the implementation to ensure it was working correctly. On many occasions, the product purchase would go through, but when trying to buy another product, the value stored in the credit variable would reset to 0. So, we had to start adding many conditions that would allow us to retrieve the remaining credit to continue purchasing. Part of the lab, especially the testbench, also posed difficulties when dealing with the conditions we had created, since some initial considerations triggered errors due to unsupported elements, we had previously been working with in System Verilog. In this case, using Verilog made it significantly more complex. I learned a lot from this lab, but I believe the difficulty level was quite high</w:t>
       </w:r>
       <w:r>
@@ -5077,8 +5398,8 @@
       </w:r>
     </w:p>
     <w:sectPr>
-      <w:headerReference w:type="default" r:id="rId31"/>
-      <w:footerReference w:type="default" r:id="rId32"/>
+      <w:headerReference w:type="default" r:id="rId39"/>
+      <w:footerReference w:type="default" r:id="rId40"/>
       <w:pgSz w:w="12240" w:h="15840"/>
       <w:pgMar w:top="1440" w:right="1440" w:bottom="1440" w:left="1440" w:header="720" w:footer="720" w:gutter="0"/>
       <w:cols w:space="720"/>

</xml_diff>